<commit_message>
feat: refine visual aesthetics and content for an ultra-clean, trustworthy, and sophisticated look
</commit_message>
<xml_diff>
--- a/public/cv_loibui.docx
+++ b/public/cv_loibui.docx
@@ -1,36 +1,30 @@
 
 <file path=word/document.xml><?xml version="1.0" encoding="utf-8"?>
-<w:document xmlns:mc="http://schemas.openxmlformats.org/markup-compatibility/2006" xmlns:o="urn:schemas-microsoft-com:office:office" xmlns:r="http://schemas.openxmlformats.org/officeDocument/2006/relationships" xmlns:m="http://schemas.openxmlformats.org/officeDocument/2006/math" xmlns:v="urn:schemas-microsoft-com:vml" xmlns:wp="http://schemas.openxmlformats.org/drawingml/2006/wordprocessingDrawing" xmlns:w10="urn:schemas-microsoft-com:office:word" xmlns:w="http://schemas.openxmlformats.org/wordprocessingml/2006/main" xmlns:wne="http://schemas.microsoft.com/office/word/2006/wordml" xmlns:sl="http://schemas.openxmlformats.org/schemaLibrary/2006/main" xmlns:a="http://schemas.openxmlformats.org/drawingml/2006/main" xmlns:pic="http://schemas.openxmlformats.org/drawingml/2006/picture" xmlns:c="http://schemas.openxmlformats.org/drawingml/2006/chart" xmlns:lc="http://schemas.openxmlformats.org/drawingml/2006/lockedCanvas" xmlns:dgm="http://schemas.openxmlformats.org/drawingml/2006/diagram" xmlns:wps="http://schemas.microsoft.com/office/word/2010/wordprocessingShape" xmlns:wpg="http://schemas.microsoft.com/office/word/2010/wordprocessingGroup" xmlns:w14="http://schemas.microsoft.com/office/word/2010/wordml" xmlns:w15="http://schemas.microsoft.com/office/word/2012/wordml" xmlns:w16="http://schemas.microsoft.com/office/word/2018/wordml" xmlns:w16cex="http://schemas.microsoft.com/office/word/2018/wordml/cex" xmlns:w16cid="http://schemas.microsoft.com/office/word/2016/wordml/cid" xmlns="http://schemas.microsoft.com/office/tasks/2019/documenttasks" xmlns:cr="http://schemas.microsoft.com/office/comments/2020/reactions">
+<w:document xmlns:wpc="http://schemas.microsoft.com/office/word/2010/wordprocessingCanvas" xmlns:cx="http://schemas.microsoft.com/office/drawing/2014/chartex" xmlns:cx1="http://schemas.microsoft.com/office/drawing/2015/9/8/chartex" xmlns:cx2="http://schemas.microsoft.com/office/drawing/2015/10/21/chartex" xmlns:cx3="http://schemas.microsoft.com/office/drawing/2016/5/9/chartex" xmlns:cx4="http://schemas.microsoft.com/office/drawing/2016/5/10/chartex" xmlns:cx5="http://schemas.microsoft.com/office/drawing/2016/5/11/chartex" xmlns:cx6="http://schemas.microsoft.com/office/drawing/2016/5/12/chartex" xmlns:cx7="http://schemas.microsoft.com/office/drawing/2016/5/13/chartex" xmlns:cx8="http://schemas.microsoft.com/office/drawing/2016/5/14/chartex" xmlns:mc="http://schemas.openxmlformats.org/markup-compatibility/2006" xmlns:m="http://schemas.openxmlformats.org/officeDocument/2006/math" xmlns:aink="http://schemas.microsoft.com/office/drawing/2016/ink" xmlns:am3d="http://schemas.microsoft.com/office/drawing/2017/model3d" xmlns:oel="http://schemas.microsoft.com/office/2019/extlst" xmlns:r="http://schemas.openxmlformats.org/officeDocument/2006/relationships" xmlns:wp14="http://schemas.microsoft.com/office/word/2010/wordprocessingDrawing" xmlns:wp="http://schemas.openxmlformats.org/drawingml/2006/wordprocessingDrawing" xmlns:wpg="http://schemas.microsoft.com/office/word/2010/wordprocessingGroup" xmlns:wpi="http://schemas.microsoft.com/office/word/2010/wordprocessingInk" xmlns:wps="http://schemas.microsoft.com/office/word/2010/wordprocessingShape" xmlns:o="urn:schemas-microsoft-com:office:office" xmlns:v="urn:schemas-microsoft-com:vml" xmlns:w10="urn:schemas-microsoft-com:office:word" xmlns:w="http://schemas.openxmlformats.org/wordprocessingml/2006/main" xmlns:w14="http://schemas.microsoft.com/office/word/2010/wordml" xmlns:w15="http://schemas.microsoft.com/office/word/2012/wordml" xmlns:w16cex="http://schemas.microsoft.com/office/word/2018/wordml/cex" xmlns:w16cid="http://schemas.microsoft.com/office/word/2016/wordml/cid" xmlns:w16="http://schemas.microsoft.com/office/word/2018/wordml" xmlns:w16sdtdh="http://schemas.microsoft.com/office/word/2020/wordml/sdtdatahash" xmlns:w16sdtfl="http://schemas.microsoft.com/office/word/2024/wordml/sdtformatlock" xmlns:w16se="http://schemas.microsoft.com/office/word/2015/wordml/symex" xmlns:w16du="http://schemas.microsoft.com/office/word/2023/wordml/word16du" xmlns:wne="http://schemas.microsoft.com/office/word/2006/wordml" mc:Ignorable="w14 w15 w16se w16cid w16 w16cex w16sdtdh w16sdtfl w16du wp14">
   <w:body>
     <w:p>
       <w:pPr>
         <w:spacing w:after="0" w:line="259" w:lineRule="auto"/>
         <w:ind w:left="0" w:right="174" w:firstLine="0"/>
         <w:jc w:val="center"/>
-        <w:rPr/>
-      </w:pPr>
-      <w:r>
-        <w:rPr>
-          <w:b w:val="1"/>
-          <w:bCs w:val="1"/>
+      </w:pPr>
+      <w:r>
+        <w:rPr>
+          <w:b/>
+          <w:bCs/>
           <w:sz w:val="40"/>
           <w:szCs w:val="40"/>
-          <w:rtl w:val="0"/>
-        </w:rPr>
-        <w:t xml:space="preserve">Loi Bui</w:t>
+        </w:rPr>
+        <w:t>Loi Bui</w:t>
       </w:r>
       <w:r>
         <w:rPr>
           <w:sz w:val="40"/>
           <w:szCs w:val="40"/>
-          <w:rtl w:val="0"/>
         </w:rPr>
         <w:t xml:space="preserve"> </w:t>
       </w:r>
       <w:r>
-        <w:rPr>
-          <w:rtl w:val="0"/>
-        </w:rPr>
         <w:t xml:space="preserve"> </w:t>
       </w:r>
       <w:r>
@@ -38,14 +32,8 @@
           <w:sz w:val="32"/>
           <w:szCs w:val="32"/>
           <w:vertAlign w:val="subscript"/>
-          <w:rtl w:val="0"/>
         </w:rPr>
         <w:t xml:space="preserve"> </w:t>
-      </w:r>
-      <w:r>
-        <w:rPr>
-          <w:rtl w:val="0"/>
-        </w:rPr>
       </w:r>
     </w:p>
     <w:p>
@@ -53,47 +41,43 @@
         <w:spacing w:after="0" w:line="259" w:lineRule="auto"/>
         <w:ind w:left="0" w:right="0" w:firstLine="0"/>
         <w:jc w:val="right"/>
-        <w:rPr/>
-      </w:pPr>
-      <w:r>
-        <w:rPr>
-          <w:rtl w:val="0"/>
-        </w:rPr>
-      </w:r>
+      </w:pPr>
     </w:p>
     <w:p>
       <w:pPr>
         <w:spacing w:after="0" w:line="259" w:lineRule="auto"/>
         <w:ind w:left="0" w:right="0" w:firstLine="0"/>
         <w:jc w:val="right"/>
-        <w:rPr/>
-      </w:pPr>
-      <w:r>
-        <w:rPr>
-          <w:rFonts w:ascii="Calibri" w:cs="Calibri" w:eastAsia="Calibri" w:hAnsi="Calibri"/>
+      </w:pPr>
+      <w:r>
+        <w:rPr>
+          <w:rFonts w:ascii="Calibri" w:eastAsia="Calibri" w:hAnsi="Calibri" w:cs="Calibri"/>
+          <w:noProof/>
           <w:sz w:val="22"/>
           <w:szCs w:val="22"/>
         </w:rPr>
         <mc:AlternateContent>
           <mc:Choice Requires="wpg">
             <w:drawing>
-              <wp:inline distB="0" distT="0" distL="0" distR="0">
+              <wp:inline distT="0" distB="0" distL="0" distR="0" wp14:anchorId="7FCB58D6" wp14:editId="371C14CF">
                 <wp:extent cx="6895465" cy="17780"/>
-                <wp:effectExtent b="0" l="0" r="0" t="0"/>
-                <wp:docPr id="1381" name=""/>
-                <a:graphic>
+                <wp:effectExtent l="0" t="0" r="0" b="0"/>
+                <wp:docPr id="1381" name="Group 1381"/>
+                <wp:cNvGraphicFramePr/>
+                <a:graphic xmlns:a="http://schemas.openxmlformats.org/drawingml/2006/main">
                   <a:graphicData uri="http://schemas.microsoft.com/office/word/2010/wordprocessingGroup">
                     <wpg:wgp>
                       <wpg:cNvGrpSpPr/>
                       <wpg:grpSpPr>
                         <a:xfrm>
-                          <a:off x="1898250" y="3771100"/>
+                          <a:off x="0" y="0"/>
                           <a:ext cx="6895465" cy="17780"/>
                           <a:chOff x="1898250" y="3771100"/>
                           <a:chExt cx="6895500" cy="17800"/>
                         </a:xfrm>
                       </wpg:grpSpPr>
                       <wpg:grpSp>
+                        <wpg:cNvPr id="206017264" name="Group 206017264"/>
                         <wpg:cNvGrpSpPr/>
                         <wpg:grpSpPr>
                           <a:xfrm>
@@ -104,8 +88,8 @@
                           </a:xfrm>
                         </wpg:grpSpPr>
                         <wps:wsp>
+                          <wps:cNvPr id="2082327696" name="Rectangle 2082327696"/>
                           <wps:cNvSpPr/>
-                          <wps:cNvPr id="3" name="Shape 3"/>
                           <wps:spPr>
                             <a:xfrm>
                               <a:off x="0" y="0"/>
@@ -123,30 +107,33 @@
                             <w:txbxContent>
                               <w:p>
                                 <w:pPr>
-                                  <w:spacing w:after="0" w:before="0" w:line="240"/>
+                                  <w:spacing w:after="0" w:line="240" w:lineRule="auto"/>
                                   <w:ind w:left="0" w:right="0" w:firstLine="0"/>
-                                  <w:jc w:val="left"/>
                                   <w:textDirection w:val="btLr"/>
                                 </w:pPr>
                               </w:p>
                             </w:txbxContent>
                           </wps:txbx>
-                          <wps:bodyPr anchorCtr="0" anchor="ctr" bIns="91425" lIns="91425" spcFirstLastPara="1" rIns="91425" wrap="square" tIns="91425">
+                          <wps:bodyPr spcFirstLastPara="1" wrap="square" lIns="91425" tIns="91425" rIns="91425" bIns="91425" anchor="ctr" anchorCtr="0">
                             <a:noAutofit/>
                           </wps:bodyPr>
                         </wps:wsp>
                         <wps:wsp>
+                          <wps:cNvPr id="743827852" name="Freeform 743827852"/>
                           <wps:cNvSpPr/>
-                          <wps:cNvPr id="6" name="Shape 6"/>
                           <wps:spPr>
                             <a:xfrm>
                               <a:off x="0" y="0"/>
                               <a:ext cx="6895465" cy="17780"/>
                             </a:xfrm>
                             <a:custGeom>
-                              <a:rect b="b" l="l" r="r" t="t"/>
+                              <a:avLst/>
+                              <a:gdLst/>
+                              <a:ahLst/>
+                              <a:cxnLst/>
+                              <a:rect l="l" t="t" r="r" b="b"/>
                               <a:pathLst>
-                                <a:path extrusionOk="0" h="17780" w="6895465">
+                                <a:path w="6895465" h="17780" extrusionOk="0">
                                   <a:moveTo>
                                     <a:pt x="0" y="0"/>
                                   </a:moveTo>
@@ -172,7 +159,7 @@
                               <a:noFill/>
                             </a:ln>
                           </wps:spPr>
-                          <wps:bodyPr anchorCtr="0" anchor="ctr" bIns="91425" lIns="91425" spcFirstLastPara="1" rIns="91425" wrap="square" tIns="91425">
+                          <wps:bodyPr spcFirstLastPara="1" wrap="square" lIns="91425" tIns="91425" rIns="91425" bIns="91425" anchor="ctr" anchorCtr="0">
                             <a:noAutofit/>
                           </wps:bodyPr>
                         </wps:wsp>
@@ -184,45 +171,33 @@
             </w:drawing>
           </mc:Choice>
           <mc:Fallback>
-            <w:drawing>
-              <wp:inline distB="0" distT="0" distL="0" distR="0">
-                <wp:extent cx="6895465" cy="17780"/>
-                <wp:effectExtent b="0" l="0" r="0" t="0"/>
-                <wp:docPr id="1381" name="image2.png"/>
-                <a:graphic>
-                  <a:graphicData uri="http://schemas.openxmlformats.org/drawingml/2006/picture">
-                    <pic:pic>
-                      <pic:nvPicPr>
-                        <pic:cNvPr id="0" name="image2.png"/>
-                        <pic:cNvPicPr preferRelativeResize="0"/>
-                      </pic:nvPicPr>
-                      <pic:blipFill>
-                        <a:blip r:embed="rId7"/>
-                        <a:srcRect/>
-                        <a:stretch>
-                          <a:fillRect/>
-                        </a:stretch>
-                      </pic:blipFill>
-                      <pic:spPr>
-                        <a:xfrm>
-                          <a:off x="0" y="0"/>
-                          <a:ext cx="6895465" cy="17780"/>
-                        </a:xfrm>
-                        <a:prstGeom prst="rect"/>
-                        <a:ln/>
-                      </pic:spPr>
-                    </pic:pic>
-                  </a:graphicData>
-                </a:graphic>
-              </wp:inline>
-            </w:drawing>
+            <w:pict>
+              <v:group w14:anchorId="7FCB58D6" id="Group 1381" o:spid="_x0000_s1026" style="width:542.95pt;height:1.4pt;mso-position-horizontal-relative:char;mso-position-vertical-relative:line" coordorigin="18982,37711" coordsize="68955,178" o:gfxdata="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">
+                <v:group id="Group 206017264" o:spid="_x0000_s1027" style="position:absolute;left:18982;top:37711;width:68955;height:177" coordsize="68954,177" o:gfxdata="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">
+                  <v:rect id="Rectangle 2082327696" o:spid="_x0000_s1028" style="position:absolute;width:68954;height:177;visibility:visible;mso-wrap-style:square;v-text-anchor:middle" o:gfxdata="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" filled="f" stroked="f">
+                    <v:textbox inset="2.53958mm,2.53958mm,2.53958mm,2.53958mm">
+                      <w:txbxContent>
+                        <w:p>
+                          <w:pPr>
+                            <w:spacing w:after="0" w:line="240" w:lineRule="auto"/>
+                            <w:ind w:left="0" w:right="0" w:firstLine="0"/>
+                            <w:textDirection w:val="btLr"/>
+                          </w:pPr>
+                        </w:p>
+                      </w:txbxContent>
+                    </v:textbox>
+                  </v:rect>
+                  <v:shape id="Freeform 743827852" o:spid="_x0000_s1029" style="position:absolute;width:68954;height:177;visibility:visible;mso-wrap-style:square;v-text-anchor:middle" coordsize="6895465,17780" o:gfxdata="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" path="m,l6895465,r,17780l,17780,,e" fillcolor="black" stroked="f">
+                    <v:path arrowok="t" o:extrusionok="f"/>
+                  </v:shape>
+                </v:group>
+                <w10:anchorlock/>
+              </v:group>
+            </w:pict>
           </mc:Fallback>
         </mc:AlternateContent>
       </w:r>
       <w:r>
-        <w:rPr>
-          <w:rtl w:val="0"/>
-        </w:rPr>
         <w:t xml:space="preserve">  </w:t>
       </w:r>
     </w:p>
@@ -230,22 +205,17 @@
       <w:pPr>
         <w:spacing w:after="18" w:line="259" w:lineRule="auto"/>
         <w:ind w:left="30" w:right="0" w:firstLine="0"/>
-        <w:rPr/>
-      </w:pPr>
-      <w:r>
-        <w:rPr>
-          <w:b w:val="1"/>
-          <w:bCs w:val="1"/>
+      </w:pPr>
+      <w:r>
+        <w:rPr>
+          <w:b/>
+          <w:bCs/>
           <w:sz w:val="22"/>
           <w:szCs w:val="22"/>
-          <w:rtl w:val="0"/>
         </w:rPr>
         <w:t xml:space="preserve"> </w:t>
       </w:r>
       <w:r>
-        <w:rPr>
-          <w:rtl w:val="0"/>
-        </w:rPr>
         <w:t xml:space="preserve">  </w:t>
       </w:r>
     </w:p>
@@ -253,37 +223,23 @@
       <w:pPr>
         <w:spacing w:after="18" w:line="259" w:lineRule="auto"/>
         <w:ind w:left="30" w:right="0" w:firstLine="0"/>
-        <w:rPr/>
-      </w:pPr>
-      <w:r>
-        <w:rPr>
-          <w:rtl w:val="0"/>
-        </w:rPr>
-        <w:t xml:space="preserve">Senior Full-Stack Engineer with 7+ years of experience building scalable web, mobile, fintech, mobility. Experienced in designing distributed systems, developing cloud-native applications, and delivering high-impact products used by thousands of customers. Strong expertise in React, React Native, Node.js, Java, Kafka, AWS, GCP, and microservices architecture. Proven ability to drive projects from concept to production while balancing technical excellence with business outcomes.</w:t>
+      </w:pPr>
+      <w:r>
+        <w:t>Senior Full-Stack Engineer with 7+ years of experience building scalable web, mobile, fintech, mobility. Experienced in designing distributed systems, developing cloud-native applications, and delivering high-impact products used by thousands of customers. Strong expertise in React, React Native, Node.js, Java, Kafka, AWS, GCP, and microservices architecture. Proven ability to drive projects from concept to production while balancing technical excellence with business outcomes.</w:t>
       </w:r>
     </w:p>
     <w:p>
       <w:pPr>
         <w:spacing w:after="18" w:line="259" w:lineRule="auto"/>
         <w:ind w:left="30" w:right="0" w:firstLine="0"/>
-        <w:rPr/>
-      </w:pPr>
-      <w:r>
-        <w:rPr>
-          <w:rtl w:val="0"/>
-        </w:rPr>
-      </w:r>
+      </w:pPr>
     </w:p>
     <w:p>
       <w:pPr>
         <w:pStyle w:val="Heading1"/>
         <w:ind w:left="-5" w:firstLine="0"/>
-        <w:rPr/>
-      </w:pPr>
-      <w:r>
-        <w:rPr>
-          <w:rtl w:val="0"/>
-        </w:rPr>
+      </w:pPr>
+      <w:r>
         <w:t xml:space="preserve">EDUCATION   </w:t>
       </w:r>
     </w:p>
@@ -292,34 +248,36 @@
         <w:spacing w:after="0" w:line="259" w:lineRule="auto"/>
         <w:ind w:left="0" w:right="0" w:firstLine="0"/>
         <w:jc w:val="right"/>
-        <w:rPr/>
-      </w:pPr>
-      <w:r>
-        <w:rPr>
-          <w:rFonts w:ascii="Calibri" w:cs="Calibri" w:eastAsia="Calibri" w:hAnsi="Calibri"/>
+      </w:pPr>
+      <w:r>
+        <w:rPr>
+          <w:rFonts w:ascii="Calibri" w:eastAsia="Calibri" w:hAnsi="Calibri" w:cs="Calibri"/>
+          <w:noProof/>
           <w:sz w:val="22"/>
           <w:szCs w:val="22"/>
         </w:rPr>
         <mc:AlternateContent>
           <mc:Choice Requires="wpg">
             <w:drawing>
-              <wp:inline distB="0" distT="0" distL="0" distR="0">
+              <wp:inline distT="0" distB="0" distL="0" distR="0" wp14:anchorId="4B5727D5" wp14:editId="69A00007">
                 <wp:extent cx="6895465" cy="8890"/>
-                <wp:effectExtent b="0" l="0" r="0" t="0"/>
-                <wp:docPr id="1380" name=""/>
-                <a:graphic>
+                <wp:effectExtent l="0" t="0" r="0" b="0"/>
+                <wp:docPr id="1380" name="Group 1380"/>
+                <wp:cNvGraphicFramePr/>
+                <a:graphic xmlns:a="http://schemas.openxmlformats.org/drawingml/2006/main">
                   <a:graphicData uri="http://schemas.microsoft.com/office/word/2010/wordprocessingGroup">
                     <wpg:wgp>
                       <wpg:cNvGrpSpPr/>
                       <wpg:grpSpPr>
                         <a:xfrm>
-                          <a:off x="1898250" y="3775550"/>
+                          <a:off x="0" y="0"/>
                           <a:ext cx="6895465" cy="8890"/>
                           <a:chOff x="1898250" y="3775550"/>
                           <a:chExt cx="6895500" cy="9150"/>
                         </a:xfrm>
                       </wpg:grpSpPr>
                       <wpg:grpSp>
+                        <wpg:cNvPr id="2026600201" name="Group 2026600201"/>
                         <wpg:cNvGrpSpPr/>
                         <wpg:grpSpPr>
                           <a:xfrm>
@@ -330,8 +288,8 @@
                           </a:xfrm>
                         </wpg:grpSpPr>
                         <wps:wsp>
+                          <wps:cNvPr id="1041922165" name="Rectangle 1041922165"/>
                           <wps:cNvSpPr/>
-                          <wps:cNvPr id="3" name="Shape 3"/>
                           <wps:spPr>
                             <a:xfrm>
                               <a:off x="0" y="0"/>
@@ -349,30 +307,33 @@
                             <w:txbxContent>
                               <w:p>
                                 <w:pPr>
-                                  <w:spacing w:after="0" w:before="0" w:line="240"/>
+                                  <w:spacing w:after="0" w:line="240" w:lineRule="auto"/>
                                   <w:ind w:left="0" w:right="0" w:firstLine="0"/>
-                                  <w:jc w:val="left"/>
                                   <w:textDirection w:val="btLr"/>
                                 </w:pPr>
                               </w:p>
                             </w:txbxContent>
                           </wps:txbx>
-                          <wps:bodyPr anchorCtr="0" anchor="ctr" bIns="91425" lIns="91425" spcFirstLastPara="1" rIns="91425" wrap="square" tIns="91425">
+                          <wps:bodyPr spcFirstLastPara="1" wrap="square" lIns="91425" tIns="91425" rIns="91425" bIns="91425" anchor="ctr" anchorCtr="0">
                             <a:noAutofit/>
                           </wps:bodyPr>
                         </wps:wsp>
                         <wps:wsp>
+                          <wps:cNvPr id="1256351413" name="Freeform 1256351413"/>
                           <wps:cNvSpPr/>
-                          <wps:cNvPr id="4" name="Shape 4"/>
                           <wps:spPr>
                             <a:xfrm>
                               <a:off x="0" y="0"/>
                               <a:ext cx="6895465" cy="9144"/>
                             </a:xfrm>
                             <a:custGeom>
-                              <a:rect b="b" l="l" r="r" t="t"/>
+                              <a:avLst/>
+                              <a:gdLst/>
+                              <a:ahLst/>
+                              <a:cxnLst/>
+                              <a:rect l="l" t="t" r="r" b="b"/>
                               <a:pathLst>
-                                <a:path extrusionOk="0" h="9144" w="6895465">
+                                <a:path w="6895465" h="9144" extrusionOk="0">
                                   <a:moveTo>
                                     <a:pt x="0" y="0"/>
                                   </a:moveTo>
@@ -398,7 +359,7 @@
                               <a:noFill/>
                             </a:ln>
                           </wps:spPr>
-                          <wps:bodyPr anchorCtr="0" anchor="ctr" bIns="91425" lIns="91425" spcFirstLastPara="1" rIns="91425" wrap="square" tIns="91425">
+                          <wps:bodyPr spcFirstLastPara="1" wrap="square" lIns="91425" tIns="91425" rIns="91425" bIns="91425" anchor="ctr" anchorCtr="0">
                             <a:noAutofit/>
                           </wps:bodyPr>
                         </wps:wsp>
@@ -410,227 +371,184 @@
             </w:drawing>
           </mc:Choice>
           <mc:Fallback>
-            <w:drawing>
-              <wp:inline distB="0" distT="0" distL="0" distR="0">
-                <wp:extent cx="6895465" cy="8890"/>
-                <wp:effectExtent b="0" l="0" r="0" t="0"/>
-                <wp:docPr id="1380" name="image1.png"/>
-                <a:graphic>
-                  <a:graphicData uri="http://schemas.openxmlformats.org/drawingml/2006/picture">
-                    <pic:pic>
-                      <pic:nvPicPr>
-                        <pic:cNvPr id="0" name="image1.png"/>
-                        <pic:cNvPicPr preferRelativeResize="0"/>
-                      </pic:nvPicPr>
-                      <pic:blipFill>
-                        <a:blip r:embed="rId7"/>
-                        <a:srcRect/>
-                        <a:stretch>
-                          <a:fillRect/>
-                        </a:stretch>
-                      </pic:blipFill>
-                      <pic:spPr>
-                        <a:xfrm>
-                          <a:off x="0" y="0"/>
-                          <a:ext cx="6895465" cy="8890"/>
-                        </a:xfrm>
-                        <a:prstGeom prst="rect"/>
-                        <a:ln/>
-                      </pic:spPr>
-                    </pic:pic>
-                  </a:graphicData>
-                </a:graphic>
-              </wp:inline>
-            </w:drawing>
+            <w:pict>
+              <v:group w14:anchorId="4B5727D5" id="Group 1380" o:spid="_x0000_s1030" style="width:542.95pt;height:.7pt;mso-position-horizontal-relative:char;mso-position-vertical-relative:line" coordorigin="18982,37755" coordsize="68955,91" o:gfxdata="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">
+                <v:group id="Group 2026600201" o:spid="_x0000_s1031" style="position:absolute;left:18982;top:37755;width:68955;height:91" coordsize="68954,91" o:gfxdata="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">
+                  <v:rect id="Rectangle 1041922165" o:spid="_x0000_s1032" style="position:absolute;width:68954;height:88;visibility:visible;mso-wrap-style:square;v-text-anchor:middle" o:gfxdata="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" filled="f" stroked="f">
+                    <v:textbox inset="2.53958mm,2.53958mm,2.53958mm,2.53958mm">
+                      <w:txbxContent>
+                        <w:p>
+                          <w:pPr>
+                            <w:spacing w:after="0" w:line="240" w:lineRule="auto"/>
+                            <w:ind w:left="0" w:right="0" w:firstLine="0"/>
+                            <w:textDirection w:val="btLr"/>
+                          </w:pPr>
+                        </w:p>
+                      </w:txbxContent>
+                    </v:textbox>
+                  </v:rect>
+                  <v:shape id="Freeform 1256351413" o:spid="_x0000_s1033" style="position:absolute;width:68954;height:91;visibility:visible;mso-wrap-style:square;v-text-anchor:middle" coordsize="6895465,9144" o:gfxdata="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" path="m,l6895465,r,9144l,9144,,e" fillcolor="black" stroked="f">
+                    <v:path arrowok="t" o:extrusionok="f"/>
+                  </v:shape>
+                </v:group>
+                <w10:anchorlock/>
+              </v:group>
+            </w:pict>
           </mc:Fallback>
         </mc:AlternateContent>
       </w:r>
       <w:r>
-        <w:rPr>
-          <w:rtl w:val="0"/>
-        </w:rPr>
         <w:t xml:space="preserve">  </w:t>
       </w:r>
     </w:p>
     <w:p>
       <w:pPr>
         <w:tabs>
-          <w:tab w:val="right" w:leader="none" w:pos="11038"/>
+          <w:tab w:val="right" w:pos="11038"/>
         </w:tabs>
         <w:spacing w:after="17" w:line="259" w:lineRule="auto"/>
         <w:ind w:left="0" w:right="0" w:firstLine="0"/>
-        <w:rPr/>
-      </w:pPr>
-      <w:r>
-        <w:rPr>
-          <w:b w:val="1"/>
-          <w:bCs w:val="1"/>
-          <w:rtl w:val="0"/>
+      </w:pPr>
+      <w:r>
+        <w:rPr>
+          <w:b/>
+          <w:bCs/>
         </w:rPr>
         <w:t xml:space="preserve">FPT University   </w:t>
+      </w:r>
+      <w:r>
+        <w:rPr>
+          <w:b/>
+          <w:bCs/>
+        </w:rPr>
         <w:tab/>
       </w:r>
       <w:r>
-        <w:rPr>
-          <w:rtl w:val="0"/>
-        </w:rPr>
         <w:t xml:space="preserve">2012-2016   </w:t>
       </w:r>
     </w:p>
     <w:p>
       <w:pPr>
         <w:ind w:left="40" w:right="111" w:firstLine="0"/>
-        <w:rPr/>
-      </w:pPr>
-      <w:r>
-        <w:rPr>
-          <w:rtl w:val="0"/>
-        </w:rPr>
-        <w:t xml:space="preserve">Bachelor of Software Engineering</w:t>
+      </w:pPr>
+      <w:r>
+        <w:t>Bachelor of Software Engineering</w:t>
       </w:r>
     </w:p>
     <w:p>
       <w:pPr>
         <w:tabs>
-          <w:tab w:val="center" w:leader="none" w:pos="1041"/>
+          <w:tab w:val="center" w:pos="1041"/>
         </w:tabs>
         <w:ind w:left="0" w:right="0"/>
-        <w:rPr/>
-      </w:pPr>
-      <w:r>
-        <w:rPr>
-          <w:rFonts w:ascii="Calibri" w:cs="Calibri" w:eastAsia="Calibri" w:hAnsi="Calibri"/>
+      </w:pPr>
+      <w:r>
+        <w:rPr>
+          <w:rFonts w:ascii="Calibri" w:eastAsia="Calibri" w:hAnsi="Calibri" w:cs="Calibri"/>
           <w:sz w:val="22"/>
           <w:szCs w:val="22"/>
-          <w:rtl w:val="0"/>
         </w:rPr>
         <w:t xml:space="preserve"> </w:t>
+      </w:r>
+      <w:r>
+        <w:rPr>
+          <w:rFonts w:ascii="Calibri" w:eastAsia="Calibri" w:hAnsi="Calibri" w:cs="Calibri"/>
+          <w:sz w:val="22"/>
+          <w:szCs w:val="22"/>
+        </w:rPr>
         <w:tab/>
         <w:t xml:space="preserve">    </w:t>
       </w:r>
       <w:r>
-        <w:rPr>
-          <w:rtl w:val="0"/>
-        </w:rPr>
         <w:t xml:space="preserve">•  Full-Tuition Scholarship </w:t>
       </w:r>
     </w:p>
     <w:p>
       <w:pPr>
         <w:tabs>
-          <w:tab w:val="center" w:leader="none" w:pos="1041"/>
+          <w:tab w:val="center" w:pos="1041"/>
         </w:tabs>
         <w:ind w:left="0" w:right="0" w:firstLine="0"/>
-        <w:rPr/>
-      </w:pPr>
-      <w:r>
-        <w:rPr>
-          <w:rtl w:val="0"/>
-        </w:rPr>
-      </w:r>
+      </w:pPr>
     </w:p>
     <w:p>
       <w:pPr>
         <w:tabs>
-          <w:tab w:val="right" w:leader="none" w:pos="11038"/>
+          <w:tab w:val="right" w:pos="11038"/>
         </w:tabs>
         <w:spacing w:after="17" w:line="259" w:lineRule="auto"/>
         <w:ind w:left="0" w:right="0"/>
-        <w:rPr/>
-      </w:pPr>
-      <w:r>
-        <w:rPr>
-          <w:b w:val="1"/>
-          <w:bCs w:val="1"/>
-          <w:rtl w:val="0"/>
+      </w:pPr>
+      <w:r>
+        <w:rPr>
+          <w:b/>
+          <w:bCs/>
         </w:rPr>
         <w:t xml:space="preserve">Hung Vuong Gifted High School   </w:t>
+      </w:r>
+      <w:r>
+        <w:rPr>
+          <w:b/>
+          <w:bCs/>
+        </w:rPr>
         <w:tab/>
       </w:r>
       <w:r>
-        <w:rPr>
-          <w:rtl w:val="0"/>
-        </w:rPr>
         <w:t xml:space="preserve">2009-2012   </w:t>
       </w:r>
     </w:p>
     <w:p>
       <w:pPr>
         <w:ind w:left="40" w:right="111" w:firstLine="0"/>
-        <w:rPr/>
-      </w:pPr>
-      <w:r>
-        <w:rPr>
-          <w:rtl w:val="0"/>
-        </w:rPr>
-        <w:t xml:space="preserve">Specialization: Mathematics</w:t>
+      </w:pPr>
+      <w:r>
+        <w:t>Specialization: Mathematics</w:t>
       </w:r>
     </w:p>
     <w:p>
       <w:pPr>
         <w:ind w:left="0" w:right="111" w:firstLine="0"/>
-        <w:rPr/>
-      </w:pPr>
-      <w:r>
-        <w:rPr>
-          <w:rFonts w:ascii="Calibri" w:cs="Calibri" w:eastAsia="Calibri" w:hAnsi="Calibri"/>
+      </w:pPr>
+      <w:r>
+        <w:rPr>
+          <w:rFonts w:ascii="Calibri" w:eastAsia="Calibri" w:hAnsi="Calibri" w:cs="Calibri"/>
           <w:sz w:val="22"/>
           <w:szCs w:val="22"/>
-          <w:rtl w:val="0"/>
         </w:rPr>
         <w:t xml:space="preserve">     </w:t>
       </w:r>
       <w:r>
-        <w:rPr>
-          <w:rtl w:val="0"/>
-        </w:rPr>
-        <w:t xml:space="preserve">•  First Prize, Youth Informatics Contest (City/Provincial levels, 2011)</w:t>
+        <w:t>•  First Prize, Youth Informatics Contest (City/Provincial levels, 2011)</w:t>
       </w:r>
     </w:p>
     <w:p>
       <w:pPr>
         <w:ind w:left="40" w:right="111" w:firstLine="0"/>
-        <w:rPr/>
-      </w:pPr>
-      <w:r>
-        <w:rPr>
-          <w:rFonts w:ascii="Calibri" w:cs="Calibri" w:eastAsia="Calibri" w:hAnsi="Calibri"/>
+      </w:pPr>
+      <w:r>
+        <w:rPr>
+          <w:rFonts w:ascii="Calibri" w:eastAsia="Calibri" w:hAnsi="Calibri" w:cs="Calibri"/>
           <w:sz w:val="22"/>
           <w:szCs w:val="22"/>
-          <w:rtl w:val="0"/>
         </w:rPr>
         <w:t xml:space="preserve">    </w:t>
       </w:r>
       <w:r>
-        <w:rPr>
-          <w:rtl w:val="0"/>
-        </w:rPr>
-        <w:t xml:space="preserve">•  Bronze Medalist, National Programming Olympiad (2011)</w:t>
+        <w:t>•  Bronze Medalist, National Programming Olympiad (2011)</w:t>
       </w:r>
     </w:p>
     <w:p>
       <w:pPr>
         <w:spacing w:after="0" w:line="259" w:lineRule="auto"/>
         <w:ind w:left="0" w:right="0"/>
-        <w:jc w:val="left"/>
-        <w:rPr/>
-      </w:pPr>
-      <w:r>
-        <w:rPr>
-          <w:rtl w:val="0"/>
-        </w:rPr>
-      </w:r>
+      </w:pPr>
     </w:p>
     <w:p>
       <w:pPr>
         <w:spacing w:after="69" w:line="259" w:lineRule="auto"/>
         <w:ind w:left="30" w:right="0" w:firstLine="0"/>
-        <w:rPr/>
-      </w:pPr>
-      <w:r>
-        <w:rPr>
-          <w:rtl w:val="0"/>
-        </w:rPr>
+      </w:pPr>
+      <w:r>
         <w:t xml:space="preserve">   </w:t>
       </w:r>
     </w:p>
@@ -638,26 +556,17 @@
       <w:pPr>
         <w:pStyle w:val="Heading1"/>
         <w:ind w:left="-5" w:firstLine="0"/>
-        <w:rPr/>
-      </w:pPr>
-      <w:r>
-        <w:rPr>
-          <w:rtl w:val="0"/>
-        </w:rPr>
-        <w:t xml:space="preserve">SOFTWARE DEVELOPMENT EXPERIENCE</w:t>
+      </w:pPr>
+      <w:r>
+        <w:t>SOFTWARE DEVELOPMENT EXPERIENCE</w:t>
       </w:r>
       <w:r>
         <w:rPr>
           <w:b w:val="0"/>
-          <w:bCs w:val="0"/>
-          <w:rtl w:val="0"/>
         </w:rPr>
         <w:t xml:space="preserve"> </w:t>
       </w:r>
       <w:r>
-        <w:rPr>
-          <w:rtl w:val="0"/>
-        </w:rPr>
         <w:t xml:space="preserve">  </w:t>
       </w:r>
     </w:p>
@@ -666,34 +575,36 @@
         <w:spacing w:after="0" w:line="259" w:lineRule="auto"/>
         <w:ind w:left="0" w:right="0" w:firstLine="0"/>
         <w:jc w:val="right"/>
-        <w:rPr/>
-      </w:pPr>
-      <w:r>
-        <w:rPr>
-          <w:rFonts w:ascii="Calibri" w:cs="Calibri" w:eastAsia="Calibri" w:hAnsi="Calibri"/>
+      </w:pPr>
+      <w:r>
+        <w:rPr>
+          <w:rFonts w:ascii="Calibri" w:eastAsia="Calibri" w:hAnsi="Calibri" w:cs="Calibri"/>
+          <w:noProof/>
           <w:sz w:val="22"/>
           <w:szCs w:val="22"/>
         </w:rPr>
         <mc:AlternateContent>
           <mc:Choice Requires="wpg">
             <w:drawing>
-              <wp:inline distB="0" distT="0" distL="0" distR="0">
+              <wp:inline distT="0" distB="0" distL="0" distR="0" wp14:anchorId="3A2DEABA" wp14:editId="0E92C7C7">
                 <wp:extent cx="6895465" cy="8763"/>
-                <wp:effectExtent b="0" l="0" r="0" t="0"/>
-                <wp:docPr id="1382" name=""/>
-                <a:graphic>
+                <wp:effectExtent l="0" t="0" r="0" b="0"/>
+                <wp:docPr id="1382" name="Group 1382"/>
+                <wp:cNvGraphicFramePr/>
+                <a:graphic xmlns:a="http://schemas.openxmlformats.org/drawingml/2006/main">
                   <a:graphicData uri="http://schemas.microsoft.com/office/word/2010/wordprocessingGroup">
                     <wpg:wgp>
                       <wpg:cNvGrpSpPr/>
                       <wpg:grpSpPr>
                         <a:xfrm>
-                          <a:off x="1898250" y="3775600"/>
+                          <a:off x="0" y="0"/>
                           <a:ext cx="6895465" cy="8763"/>
                           <a:chOff x="1898250" y="3775600"/>
                           <a:chExt cx="6895500" cy="9175"/>
                         </a:xfrm>
                       </wpg:grpSpPr>
                       <wpg:grpSp>
+                        <wpg:cNvPr id="1077892559" name="Group 1077892559"/>
                         <wpg:cNvGrpSpPr/>
                         <wpg:grpSpPr>
                           <a:xfrm>
@@ -704,8 +615,8 @@
                           </a:xfrm>
                         </wpg:grpSpPr>
                         <wps:wsp>
+                          <wps:cNvPr id="284889129" name="Rectangle 284889129"/>
                           <wps:cNvSpPr/>
-                          <wps:cNvPr id="3" name="Shape 3"/>
                           <wps:spPr>
                             <a:xfrm>
                               <a:off x="0" y="0"/>
@@ -723,30 +634,33 @@
                             <w:txbxContent>
                               <w:p>
                                 <w:pPr>
-                                  <w:spacing w:after="0" w:before="0" w:line="240"/>
+                                  <w:spacing w:after="0" w:line="240" w:lineRule="auto"/>
                                   <w:ind w:left="0" w:right="0" w:firstLine="0"/>
-                                  <w:jc w:val="left"/>
                                   <w:textDirection w:val="btLr"/>
                                 </w:pPr>
                               </w:p>
                             </w:txbxContent>
                           </wps:txbx>
-                          <wps:bodyPr anchorCtr="0" anchor="ctr" bIns="91425" lIns="91425" spcFirstLastPara="1" rIns="91425" wrap="square" tIns="91425">
+                          <wps:bodyPr spcFirstLastPara="1" wrap="square" lIns="91425" tIns="91425" rIns="91425" bIns="91425" anchor="ctr" anchorCtr="0">
                             <a:noAutofit/>
                           </wps:bodyPr>
                         </wps:wsp>
                         <wps:wsp>
+                          <wps:cNvPr id="490709103" name="Freeform 490709103"/>
                           <wps:cNvSpPr/>
-                          <wps:cNvPr id="8" name="Shape 8"/>
                           <wps:spPr>
                             <a:xfrm>
                               <a:off x="0" y="0"/>
                               <a:ext cx="6895465" cy="9144"/>
                             </a:xfrm>
                             <a:custGeom>
-                              <a:rect b="b" l="l" r="r" t="t"/>
+                              <a:avLst/>
+                              <a:gdLst/>
+                              <a:ahLst/>
+                              <a:cxnLst/>
+                              <a:rect l="l" t="t" r="r" b="b"/>
                               <a:pathLst>
-                                <a:path extrusionOk="0" h="9144" w="6895465">
+                                <a:path w="6895465" h="9144" extrusionOk="0">
                                   <a:moveTo>
                                     <a:pt x="0" y="0"/>
                                   </a:moveTo>
@@ -772,7 +686,7 @@
                               <a:noFill/>
                             </a:ln>
                           </wps:spPr>
-                          <wps:bodyPr anchorCtr="0" anchor="ctr" bIns="91425" lIns="91425" spcFirstLastPara="1" rIns="91425" wrap="square" tIns="91425">
+                          <wps:bodyPr spcFirstLastPara="1" wrap="square" lIns="91425" tIns="91425" rIns="91425" bIns="91425" anchor="ctr" anchorCtr="0">
                             <a:noAutofit/>
                           </wps:bodyPr>
                         </wps:wsp>
@@ -784,52 +698,40 @@
             </w:drawing>
           </mc:Choice>
           <mc:Fallback>
-            <w:drawing>
-              <wp:inline distB="0" distT="0" distL="0" distR="0">
-                <wp:extent cx="6895465" cy="8763"/>
-                <wp:effectExtent b="0" l="0" r="0" t="0"/>
-                <wp:docPr id="1382" name="image3.png"/>
-                <a:graphic>
-                  <a:graphicData uri="http://schemas.openxmlformats.org/drawingml/2006/picture">
-                    <pic:pic>
-                      <pic:nvPicPr>
-                        <pic:cNvPr id="0" name="image3.png"/>
-                        <pic:cNvPicPr preferRelativeResize="0"/>
-                      </pic:nvPicPr>
-                      <pic:blipFill>
-                        <a:blip r:embed="rId7"/>
-                        <a:srcRect/>
-                        <a:stretch>
-                          <a:fillRect/>
-                        </a:stretch>
-                      </pic:blipFill>
-                      <pic:spPr>
-                        <a:xfrm>
-                          <a:off x="0" y="0"/>
-                          <a:ext cx="6895465" cy="8763"/>
-                        </a:xfrm>
-                        <a:prstGeom prst="rect"/>
-                        <a:ln/>
-                      </pic:spPr>
-                    </pic:pic>
-                  </a:graphicData>
-                </a:graphic>
-              </wp:inline>
-            </w:drawing>
+            <w:pict>
+              <v:group w14:anchorId="3A2DEABA" id="Group 1382" o:spid="_x0000_s1034" style="width:542.95pt;height:.7pt;mso-position-horizontal-relative:char;mso-position-vertical-relative:line" coordorigin="18982,37756" coordsize="68955,91" o:gfxdata="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">
+                <v:group id="Group 1077892559" o:spid="_x0000_s1035" style="position:absolute;left:18982;top:37756;width:68955;height:91" coordsize="68954,91" o:gfxdata="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">
+                  <v:rect id="Rectangle 284889129" o:spid="_x0000_s1036" style="position:absolute;width:68954;height:87;visibility:visible;mso-wrap-style:square;v-text-anchor:middle" o:gfxdata="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" filled="f" stroked="f">
+                    <v:textbox inset="2.53958mm,2.53958mm,2.53958mm,2.53958mm">
+                      <w:txbxContent>
+                        <w:p>
+                          <w:pPr>
+                            <w:spacing w:after="0" w:line="240" w:lineRule="auto"/>
+                            <w:ind w:left="0" w:right="0" w:firstLine="0"/>
+                            <w:textDirection w:val="btLr"/>
+                          </w:pPr>
+                        </w:p>
+                      </w:txbxContent>
+                    </v:textbox>
+                  </v:rect>
+                  <v:shape id="Freeform 490709103" o:spid="_x0000_s1037" style="position:absolute;width:68954;height:91;visibility:visible;mso-wrap-style:square;v-text-anchor:middle" coordsize="6895465,9144" o:gfxdata="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" path="m,l6895465,r,9144l,9144,,e" fillcolor="black" stroked="f">
+                    <v:path arrowok="t" o:extrusionok="f"/>
+                  </v:shape>
+                </v:group>
+                <w10:anchorlock/>
+              </v:group>
+            </w:pict>
           </mc:Fallback>
         </mc:AlternateContent>
       </w:r>
       <w:r>
-        <w:rPr>
-          <w:rtl w:val="0"/>
-        </w:rPr>
         <w:t xml:space="preserve">  </w:t>
       </w:r>
     </w:p>
     <w:p>
       <w:pPr>
         <w:tabs>
-          <w:tab w:val="right" w:leader="none" w:pos="11038"/>
+          <w:tab w:val="right" w:pos="11038"/>
         </w:tabs>
         <w:ind w:left="0" w:right="0" w:firstLine="0"/>
         <w:rPr>
@@ -839,24 +741,35 @@
       </w:pPr>
       <w:r>
         <w:rPr>
-          <w:b w:val="1"/>
-          <w:bCs w:val="1"/>
-          <w:rtl w:val="0"/>
-        </w:rPr>
-        <w:t xml:space="preserve">Full-Stack Developer</w:t>
-      </w:r>
-      <w:r>
-        <w:rPr>
-          <w:rtl w:val="0"/>
-        </w:rPr>
-        <w:t xml:space="preserve">, Remote   </w:t>
+          <w:b/>
+          <w:bCs/>
+        </w:rPr>
+        <w:t>Full-Stack Developer</w:t>
+      </w:r>
+      <w:r>
+        <w:t xml:space="preserve">, </w:t>
+      </w:r>
+      <w:r>
+        <w:rPr>
+          <w:color w:val="080809"/>
+          <w:sz w:val="23"/>
+          <w:szCs w:val="23"/>
+          <w:shd w:val="clear" w:color="auto" w:fill="FFFFFF"/>
+        </w:rPr>
+        <w:t>Data-backed crypto analysis</w:t>
+      </w:r>
+      <w:r>
+        <w:rPr>
+          <w:color w:val="080809"/>
+          <w:sz w:val="23"/>
+          <w:szCs w:val="23"/>
+          <w:shd w:val="clear" w:color="auto" w:fill="FFFFFF"/>
+        </w:rPr>
+        <w:t xml:space="preserve"> platform</w:t>
+      </w:r>
+      <w:r>
         <w:tab/>
         <w:t xml:space="preserve">2025-present   </w:t>
-      </w:r>
-      <w:r>
-        <w:rPr>
-          <w:rtl w:val="0"/>
-        </w:rPr>
       </w:r>
     </w:p>
     <w:p>
@@ -865,20 +778,18 @@
           <w:ilvl w:val="0"/>
           <w:numId w:val="1"/>
         </w:numPr>
-        <w:ind w:left="705" w:right="111" w:hanging="360"/>
+        <w:ind w:right="111" w:hanging="360"/>
         <w:rPr>
           <w:sz w:val="20"/>
           <w:szCs w:val="20"/>
-          <w:u w:val="none"/>
         </w:rPr>
       </w:pPr>
       <w:r>
         <w:rPr>
           <w:sz w:val="20"/>
           <w:szCs w:val="20"/>
-          <w:rtl w:val="0"/>
-        </w:rPr>
-        <w:t xml:space="preserve">Architected and launched a blockchain analytics platform providing real-time market intelligence, portfolio tracking, and community-driven insights.</w:t>
+        </w:rPr>
+        <w:t>Architected and launched a blockchain analytics platform providing real-time market intelligence, portfolio tracking, and community-driven insights.</w:t>
       </w:r>
     </w:p>
     <w:p>
@@ -887,20 +798,18 @@
           <w:ilvl w:val="0"/>
           <w:numId w:val="1"/>
         </w:numPr>
-        <w:ind w:left="705" w:right="111" w:hanging="360"/>
+        <w:ind w:right="111" w:hanging="360"/>
         <w:rPr>
           <w:sz w:val="20"/>
           <w:szCs w:val="20"/>
-          <w:u w:val="none"/>
         </w:rPr>
       </w:pPr>
       <w:r>
         <w:rPr>
           <w:sz w:val="20"/>
           <w:szCs w:val="20"/>
-          <w:rtl w:val="0"/>
-        </w:rPr>
-        <w:t xml:space="preserve">Designed scalable data pipelines using Kafka and Elasticsearch, reducing processing latency by 15% and improving data accuracy by 10%.</w:t>
+        </w:rPr>
+        <w:t>Designed scalable data pipelines using Kafka and Elasticsearch, reducing processing latency by 15% and improving data accuracy by 10%.</w:t>
       </w:r>
     </w:p>
     <w:p>
@@ -909,43 +818,36 @@
           <w:ilvl w:val="0"/>
           <w:numId w:val="1"/>
         </w:numPr>
-        <w:ind w:left="705" w:right="111" w:hanging="360"/>
+        <w:ind w:right="111" w:hanging="360"/>
         <w:rPr>
           <w:sz w:val="20"/>
           <w:szCs w:val="20"/>
-          <w:u w:val="none"/>
         </w:rPr>
       </w:pPr>
       <w:r>
         <w:rPr>
           <w:sz w:val="20"/>
           <w:szCs w:val="20"/>
-          <w:rtl w:val="0"/>
-        </w:rPr>
-        <w:t xml:space="preserve">Delivered high-performance analytics dashboards that transformed complex blockchain data into actionable business insights.</w:t>
+        </w:rPr>
+        <w:t>Delivered high-performance analytics dashboards that transformed complex blockchain data into actionable business insights.</w:t>
       </w:r>
     </w:p>
     <w:p>
       <w:pPr>
         <w:tabs>
-          <w:tab w:val="right" w:leader="none" w:pos="11038"/>
+          <w:tab w:val="right" w:pos="11038"/>
         </w:tabs>
         <w:ind w:left="0" w:right="0"/>
         <w:rPr>
-          <w:b w:val="1"/>
-          <w:bCs w:val="1"/>
-        </w:rPr>
-      </w:pPr>
-      <w:r>
-        <w:rPr>
-          <w:rtl w:val="0"/>
-        </w:rPr>
-      </w:r>
+          <w:b/>
+          <w:bCs/>
+        </w:rPr>
+      </w:pPr>
     </w:p>
     <w:p>
       <w:pPr>
         <w:tabs>
-          <w:tab w:val="right" w:leader="none" w:pos="11038"/>
+          <w:tab w:val="right" w:pos="11038"/>
         </w:tabs>
         <w:ind w:left="0" w:right="0"/>
         <w:rPr>
@@ -955,24 +857,17 @@
       </w:pPr>
       <w:r>
         <w:rPr>
-          <w:b w:val="1"/>
-          <w:bCs w:val="1"/>
-          <w:rtl w:val="0"/>
-        </w:rPr>
-        <w:t xml:space="preserve">Full-Stack Developer</w:t>
-      </w:r>
-      <w:r>
-        <w:rPr>
-          <w:rtl w:val="0"/>
-        </w:rPr>
+          <w:b/>
+          <w:bCs/>
+        </w:rPr>
+        <w:t>Full-Stack Developer</w:t>
+      </w:r>
+      <w:r>
         <w:t xml:space="preserve">, Anfin Services   </w:t>
+      </w:r>
+      <w:r>
         <w:tab/>
         <w:t xml:space="preserve">2023-2024   </w:t>
-      </w:r>
-      <w:r>
-        <w:rPr>
-          <w:rtl w:val="0"/>
-        </w:rPr>
       </w:r>
     </w:p>
     <w:p>
@@ -981,15 +876,14 @@
           <w:ilvl w:val="0"/>
           <w:numId w:val="1"/>
         </w:numPr>
-        <w:ind w:left="705" w:right="111" w:hanging="360"/>
+        <w:ind w:right="111" w:hanging="360"/>
       </w:pPr>
       <w:r>
         <w:rPr>
           <w:sz w:val="20"/>
           <w:szCs w:val="20"/>
-          <w:rtl w:val="0"/>
-        </w:rPr>
-        <w:t xml:space="preserve">Built and scaled key features for a fintech super-app covering investment, savings, and trading products.</w:t>
+        </w:rPr>
+        <w:t>Built and scaled key features for a fintech super-app covering investment, savings, and trading products.</w:t>
       </w:r>
     </w:p>
     <w:p>
@@ -998,15 +892,14 @@
           <w:ilvl w:val="0"/>
           <w:numId w:val="1"/>
         </w:numPr>
-        <w:ind w:left="705" w:right="111" w:hanging="360"/>
+        <w:ind w:right="111" w:hanging="360"/>
       </w:pPr>
       <w:r>
         <w:rPr>
           <w:sz w:val="20"/>
           <w:szCs w:val="20"/>
-          <w:rtl w:val="0"/>
-        </w:rPr>
-        <w:t xml:space="preserve">Led development of robo-advisor solutions that enhanced portfolio management and investment decision-making.</w:t>
+        </w:rPr>
+        <w:t>Led development of robo-advisor solutions that enhanced portfolio management and investment decision-making.</w:t>
       </w:r>
     </w:p>
     <w:p>
@@ -1015,15 +908,14 @@
           <w:ilvl w:val="0"/>
           <w:numId w:val="1"/>
         </w:numPr>
-        <w:ind w:left="705" w:right="111" w:hanging="360"/>
+        <w:ind w:right="111" w:hanging="360"/>
       </w:pPr>
       <w:r>
         <w:rPr>
           <w:sz w:val="20"/>
           <w:szCs w:val="20"/>
-          <w:rtl w:val="0"/>
-        </w:rPr>
-        <w:t xml:space="preserve">Improved platform scalability and performance through backend optimization and cloud infrastructure enhancements on GCP.</w:t>
+        </w:rPr>
+        <w:t>Improved platform scalability and performance through backend optimization and cloud infrastructure enhancements on GCP.</w:t>
       </w:r>
     </w:p>
     <w:p>
@@ -1034,16 +926,11 @@
           <w:szCs w:val="20"/>
         </w:rPr>
       </w:pPr>
-      <w:r>
-        <w:rPr>
-          <w:rtl w:val="0"/>
-        </w:rPr>
-      </w:r>
     </w:p>
     <w:p>
       <w:pPr>
         <w:tabs>
-          <w:tab w:val="right" w:leader="none" w:pos="11038"/>
+          <w:tab w:val="right" w:pos="11038"/>
         </w:tabs>
         <w:ind w:left="0" w:right="0"/>
         <w:rPr>
@@ -1053,24 +940,17 @@
       </w:pPr>
       <w:r>
         <w:rPr>
-          <w:b w:val="1"/>
-          <w:bCs w:val="1"/>
-          <w:rtl w:val="0"/>
-        </w:rPr>
-        <w:t xml:space="preserve">Full-Stack Developer</w:t>
-      </w:r>
-      <w:r>
-        <w:rPr>
-          <w:rtl w:val="0"/>
-        </w:rPr>
+          <w:b/>
+          <w:bCs/>
+        </w:rPr>
+        <w:t>Full-Stack Developer</w:t>
+      </w:r>
+      <w:r>
         <w:t xml:space="preserve">, Futa Platform   </w:t>
+      </w:r>
+      <w:r>
         <w:tab/>
         <w:t xml:space="preserve">2021-2022   </w:t>
-      </w:r>
-      <w:r>
-        <w:rPr>
-          <w:rtl w:val="0"/>
-        </w:rPr>
       </w:r>
     </w:p>
     <w:p>
@@ -1079,15 +959,14 @@
           <w:ilvl w:val="0"/>
           <w:numId w:val="1"/>
         </w:numPr>
-        <w:ind w:left="705" w:right="111" w:hanging="421.53543307086625"/>
+        <w:ind w:right="111" w:hanging="421"/>
       </w:pPr>
       <w:r>
         <w:rPr>
           <w:sz w:val="20"/>
           <w:szCs w:val="20"/>
-          <w:rtl w:val="0"/>
-        </w:rPr>
-        <w:t xml:space="preserve">Developed and scaled core services powering mobility, delivery, and digital payment ecosystems.</w:t>
+        </w:rPr>
+        <w:t>Developed and scaled core services powering mobility, delivery, and digital payment ecosystems.</w:t>
       </w:r>
     </w:p>
     <w:p>
@@ -1096,15 +975,14 @@
           <w:ilvl w:val="0"/>
           <w:numId w:val="1"/>
         </w:numPr>
-        <w:ind w:left="705" w:right="111" w:hanging="421.53543307086625"/>
+        <w:ind w:right="111" w:hanging="421"/>
       </w:pPr>
       <w:r>
         <w:rPr>
           <w:sz w:val="20"/>
           <w:szCs w:val="20"/>
-          <w:rtl w:val="0"/>
-        </w:rPr>
-        <w:t xml:space="preserve">Integrated major payment providers including MoMo, VNPay, ZaloPay, and QR Payments, increasing transaction success rates by 15%.</w:t>
+        </w:rPr>
+        <w:t>Integrated major payment providers including MoMo, VNPay, ZaloPay, and QR Payments, increasing transaction success rates by 15%.</w:t>
       </w:r>
     </w:p>
     <w:p>
@@ -1113,55 +991,46 @@
           <w:ilvl w:val="0"/>
           <w:numId w:val="1"/>
         </w:numPr>
-        <w:ind w:left="705" w:right="111" w:hanging="421.53543307086625"/>
+        <w:ind w:right="111" w:hanging="421"/>
       </w:pPr>
       <w:r>
         <w:rPr>
           <w:sz w:val="20"/>
           <w:szCs w:val="20"/>
-          <w:rtl w:val="0"/>
-        </w:rPr>
-        <w:t xml:space="preserve">Optimized backend architecture and APIs to improve system reliability, performance, and operational efficiency.</w:t>
+        </w:rPr>
+        <w:t>Optimized backend architecture and APIs to improve system reliability, performance, and operational efficiency.</w:t>
       </w:r>
     </w:p>
     <w:p>
       <w:pPr>
         <w:tabs>
-          <w:tab w:val="right" w:leader="none" w:pos="11038"/>
+          <w:tab w:val="right" w:pos="11038"/>
         </w:tabs>
-        <w:ind w:left="0" w:right="0" w:firstLine="283.46456692913375"/>
-        <w:rPr>
-          <w:b w:val="1"/>
-          <w:bCs w:val="1"/>
-        </w:rPr>
-      </w:pPr>
-      <w:r>
-        <w:rPr>
-          <w:rtl w:val="0"/>
-        </w:rPr>
-      </w:r>
+        <w:ind w:left="0" w:right="0" w:firstLine="283"/>
+        <w:rPr>
+          <w:b/>
+          <w:bCs/>
+        </w:rPr>
+      </w:pPr>
     </w:p>
     <w:p>
       <w:pPr>
         <w:tabs>
-          <w:tab w:val="right" w:leader="none" w:pos="11038"/>
+          <w:tab w:val="right" w:pos="11038"/>
         </w:tabs>
         <w:ind w:left="0" w:right="0"/>
-        <w:rPr/>
-      </w:pPr>
-      <w:r>
-        <w:rPr>
-          <w:b w:val="1"/>
-          <w:bCs w:val="1"/>
-          <w:rtl w:val="0"/>
-        </w:rPr>
-        <w:t xml:space="preserve">Full-Stack Developer</w:t>
-      </w:r>
-      <w:r>
-        <w:rPr>
-          <w:rtl w:val="0"/>
-        </w:rPr>
+      </w:pPr>
+      <w:r>
+        <w:rPr>
+          <w:b/>
+          <w:bCs/>
+        </w:rPr>
+        <w:t>Full-Stack Developer</w:t>
+      </w:r>
+      <w:r>
         <w:t xml:space="preserve">, Tale Technologies   </w:t>
+      </w:r>
+      <w:r>
         <w:tab/>
         <w:t xml:space="preserve">2019-2020   </w:t>
       </w:r>
@@ -1172,16 +1041,14 @@
           <w:ilvl w:val="0"/>
           <w:numId w:val="1"/>
         </w:numPr>
-        <w:ind w:left="705" w:right="111" w:hanging="421.53543307086625"/>
-        <w:rPr/>
+        <w:ind w:right="111" w:hanging="421"/>
       </w:pPr>
       <w:r>
         <w:rPr>
           <w:sz w:val="20"/>
           <w:szCs w:val="20"/>
-          <w:rtl w:val="0"/>
-        </w:rPr>
-        <w:t xml:space="preserve">Delivered TaleCity, an Apple-featured travel platform delivering personalized destination recommendations and trip planning experiences.</w:t>
+        </w:rPr>
+        <w:t>Delivered TaleCity, an Apple-featured travel platform delivering personalized destination recommendations and trip planning experiences.</w:t>
       </w:r>
     </w:p>
     <w:p>
@@ -1190,16 +1057,15 @@
           <w:ilvl w:val="0"/>
           <w:numId w:val="1"/>
         </w:numPr>
-        <w:ind w:left="705" w:right="111" w:hanging="421.53543307086625"/>
-        <w:rPr/>
+        <w:ind w:right="111" w:hanging="421"/>
       </w:pPr>
       <w:r>
         <w:rPr>
           <w:sz w:val="20"/>
           <w:szCs w:val="20"/>
-          <w:rtl w:val="0"/>
-        </w:rPr>
-        <w:t xml:space="preserve">Built TalePass, a digital ecosystem connecting travelers and tour operators through seamless booking and trip management workflows.</w:t>
+        </w:rPr>
+        <w:lastRenderedPageBreak/>
+        <w:t>Built TalePass, a digital ecosystem connecting travelers and tour operators through seamless booking and trip management workflows.</w:t>
       </w:r>
     </w:p>
     <w:p>
@@ -1208,39 +1074,32 @@
           <w:ilvl w:val="0"/>
           <w:numId w:val="1"/>
         </w:numPr>
-        <w:ind w:left="705" w:right="111" w:hanging="421.53543307086625"/>
-        <w:rPr/>
+        <w:ind w:right="111" w:hanging="421"/>
       </w:pPr>
       <w:r>
         <w:rPr>
           <w:sz w:val="20"/>
           <w:szCs w:val="20"/>
-          <w:rtl w:val="0"/>
-        </w:rPr>
-        <w:t xml:space="preserve">Delivered intelligent recommendation, voice recognition, and marketing automation features that increased platform adoption by 20%.</w:t>
+        </w:rPr>
+        <w:t>Delivered intelligent recommendation, voice recognition, and marketing automation features that increased platform adoption by 20%.</w:t>
       </w:r>
     </w:p>
     <w:p>
       <w:pPr>
         <w:tabs>
-          <w:tab w:val="right" w:leader="none" w:pos="11038"/>
+          <w:tab w:val="right" w:pos="11038"/>
         </w:tabs>
         <w:ind w:left="0" w:right="0"/>
         <w:rPr>
-          <w:b w:val="1"/>
-          <w:bCs w:val="1"/>
-        </w:rPr>
-      </w:pPr>
-      <w:r>
-        <w:rPr>
-          <w:rtl w:val="0"/>
-        </w:rPr>
-      </w:r>
+          <w:b/>
+          <w:bCs/>
+        </w:rPr>
+      </w:pPr>
     </w:p>
     <w:p>
       <w:pPr>
         <w:tabs>
-          <w:tab w:val="right" w:leader="none" w:pos="11038"/>
+          <w:tab w:val="right" w:pos="11038"/>
         </w:tabs>
         <w:ind w:left="0" w:right="0"/>
         <w:rPr>
@@ -1250,24 +1109,17 @@
       </w:pPr>
       <w:r>
         <w:rPr>
-          <w:b w:val="1"/>
-          <w:bCs w:val="1"/>
-          <w:rtl w:val="0"/>
-        </w:rPr>
-        <w:t xml:space="preserve">Java Developer</w:t>
-      </w:r>
-      <w:r>
-        <w:rPr>
-          <w:rtl w:val="0"/>
-        </w:rPr>
+          <w:b/>
+          <w:bCs/>
+        </w:rPr>
+        <w:t>Java Developer</w:t>
+      </w:r>
+      <w:r>
         <w:t xml:space="preserve">, Denso Japan (Onsite)  </w:t>
+      </w:r>
+      <w:r>
         <w:tab/>
         <w:t xml:space="preserve">2018-2019   </w:t>
-      </w:r>
-      <w:r>
-        <w:rPr>
-          <w:rtl w:val="0"/>
-        </w:rPr>
       </w:r>
     </w:p>
     <w:p>
@@ -1276,15 +1128,14 @@
           <w:ilvl w:val="0"/>
           <w:numId w:val="1"/>
         </w:numPr>
-        <w:ind w:left="705" w:right="111" w:hanging="421.53543307086625"/>
+        <w:ind w:right="111" w:hanging="421"/>
       </w:pPr>
       <w:r>
         <w:rPr>
           <w:sz w:val="20"/>
           <w:szCs w:val="20"/>
-          <w:rtl w:val="0"/>
-        </w:rPr>
-        <w:t xml:space="preserve">Engineered core components for next-generation Internet of Vehicles (IoV) platforms, including OTA updates, IoT gateways, and remote diagnostics.</w:t>
+        </w:rPr>
+        <w:t>Engineered core components for next-generation Internet of Vehicles (IoV) platforms, including OTA updates, IoT gateways, and remote diagnostics.</w:t>
       </w:r>
     </w:p>
     <w:p>
@@ -1293,15 +1144,14 @@
           <w:ilvl w:val="0"/>
           <w:numId w:val="1"/>
         </w:numPr>
-        <w:ind w:left="705" w:right="111" w:hanging="421.53543307086625"/>
+        <w:ind w:right="111" w:hanging="421"/>
       </w:pPr>
       <w:r>
         <w:rPr>
           <w:sz w:val="20"/>
           <w:szCs w:val="20"/>
-          <w:rtl w:val="0"/>
-        </w:rPr>
-        <w:t xml:space="preserve">Contributed to strategic platform initiatives showcased at major automotive technology exhibitions.</w:t>
+        </w:rPr>
+        <w:t>Contributed to strategic platform initiatives showcased at major automotive technology exhibitions.</w:t>
       </w:r>
     </w:p>
     <w:p>
@@ -1310,15 +1160,14 @@
           <w:ilvl w:val="0"/>
           <w:numId w:val="1"/>
         </w:numPr>
-        <w:ind w:left="705" w:right="111" w:hanging="421.53543307086625"/>
+        <w:ind w:right="111" w:hanging="421"/>
       </w:pPr>
       <w:r>
         <w:rPr>
           <w:sz w:val="20"/>
           <w:szCs w:val="20"/>
-          <w:rtl w:val="0"/>
-        </w:rPr>
-        <w:t xml:space="preserve">Developed real-time vehicle monitoring capabilities that enhanced fleet visibility, diagnostics, and operational efficiency.</w:t>
+        </w:rPr>
+        <w:t>Developed real-time vehicle monitoring capabilities that enhanced fleet visibility, diagnostics, and operational efficiency.</w:t>
       </w:r>
     </w:p>
     <w:p>
@@ -1330,33 +1179,25 @@
           <w:szCs w:val="20"/>
         </w:rPr>
       </w:pPr>
-      <w:r>
-        <w:rPr>
-          <w:rtl w:val="0"/>
-        </w:rPr>
-      </w:r>
     </w:p>
     <w:p>
       <w:pPr>
         <w:tabs>
-          <w:tab w:val="right" w:leader="none" w:pos="11038"/>
+          <w:tab w:val="right" w:pos="11038"/>
         </w:tabs>
         <w:ind w:left="0" w:right="0"/>
-        <w:rPr/>
-      </w:pPr>
-      <w:r>
-        <w:rPr>
-          <w:b w:val="1"/>
-          <w:bCs w:val="1"/>
-          <w:rtl w:val="0"/>
-        </w:rPr>
-        <w:t xml:space="preserve">Junior Developer</w:t>
-      </w:r>
-      <w:r>
-        <w:rPr>
-          <w:rtl w:val="0"/>
-        </w:rPr>
+      </w:pPr>
+      <w:r>
+        <w:rPr>
+          <w:b/>
+          <w:bCs/>
+        </w:rPr>
+        <w:t>Junior Developer</w:t>
+      </w:r>
+      <w:r>
         <w:t xml:space="preserve">, FPT Software </w:t>
+      </w:r>
+      <w:r>
         <w:tab/>
         <w:t xml:space="preserve">2017-2018   </w:t>
       </w:r>
@@ -1364,24 +1205,14 @@
     <w:p>
       <w:pPr>
         <w:ind w:left="0" w:right="111" w:firstLine="0"/>
-        <w:rPr/>
-      </w:pPr>
-      <w:r>
-        <w:rPr>
-          <w:rtl w:val="0"/>
-        </w:rPr>
-      </w:r>
+      </w:pPr>
     </w:p>
     <w:p>
       <w:pPr>
         <w:spacing w:after="59" w:line="259" w:lineRule="auto"/>
         <w:ind w:left="30" w:right="0" w:firstLine="0"/>
-        <w:rPr/>
-      </w:pPr>
-      <w:r>
-        <w:rPr>
-          <w:rtl w:val="0"/>
-        </w:rPr>
+      </w:pPr>
+      <w:r>
         <w:t xml:space="preserve">    </w:t>
       </w:r>
     </w:p>
@@ -1389,26 +1220,17 @@
       <w:pPr>
         <w:pStyle w:val="Heading1"/>
         <w:ind w:left="-5" w:firstLine="0"/>
-        <w:rPr/>
-      </w:pPr>
-      <w:r>
-        <w:rPr>
-          <w:rtl w:val="0"/>
-        </w:rPr>
-        <w:t xml:space="preserve">TECHNICAL SKILLS</w:t>
+      </w:pPr>
+      <w:r>
+        <w:t>TECHNICAL SKILLS</w:t>
       </w:r>
       <w:r>
         <w:rPr>
           <w:b w:val="0"/>
-          <w:bCs w:val="0"/>
-          <w:rtl w:val="0"/>
         </w:rPr>
         <w:t xml:space="preserve"> </w:t>
       </w:r>
       <w:r>
-        <w:rPr>
-          <w:rtl w:val="0"/>
-        </w:rPr>
         <w:t xml:space="preserve">  </w:t>
       </w:r>
     </w:p>
@@ -1417,34 +1239,36 @@
         <w:spacing w:after="0" w:line="259" w:lineRule="auto"/>
         <w:ind w:left="0" w:right="0" w:firstLine="0"/>
         <w:jc w:val="right"/>
-        <w:rPr/>
-      </w:pPr>
-      <w:r>
-        <w:rPr>
-          <w:rFonts w:ascii="Calibri" w:cs="Calibri" w:eastAsia="Calibri" w:hAnsi="Calibri"/>
+      </w:pPr>
+      <w:r>
+        <w:rPr>
+          <w:rFonts w:ascii="Calibri" w:eastAsia="Calibri" w:hAnsi="Calibri" w:cs="Calibri"/>
+          <w:noProof/>
           <w:sz w:val="22"/>
           <w:szCs w:val="22"/>
         </w:rPr>
         <mc:AlternateContent>
           <mc:Choice Requires="wpg">
             <w:drawing>
-              <wp:inline distB="0" distT="0" distL="0" distR="0">
+              <wp:inline distT="0" distB="0" distL="0" distR="0" wp14:anchorId="3006C77B" wp14:editId="0F1F7747">
                 <wp:extent cx="6895465" cy="8636"/>
-                <wp:effectExtent b="0" l="0" r="0" t="0"/>
-                <wp:docPr id="1383" name=""/>
-                <a:graphic>
+                <wp:effectExtent l="0" t="0" r="0" b="0"/>
+                <wp:docPr id="1383" name="Group 1383"/>
+                <wp:cNvGraphicFramePr/>
+                <a:graphic xmlns:a="http://schemas.openxmlformats.org/drawingml/2006/main">
                   <a:graphicData uri="http://schemas.microsoft.com/office/word/2010/wordprocessingGroup">
                     <wpg:wgp>
                       <wpg:cNvGrpSpPr/>
                       <wpg:grpSpPr>
                         <a:xfrm>
-                          <a:off x="1898250" y="3775675"/>
+                          <a:off x="0" y="0"/>
                           <a:ext cx="6895465" cy="8636"/>
                           <a:chOff x="1898250" y="3775675"/>
                           <a:chExt cx="6895500" cy="9175"/>
                         </a:xfrm>
                       </wpg:grpSpPr>
                       <wpg:grpSp>
+                        <wpg:cNvPr id="1677470627" name="Group 1677470627"/>
                         <wpg:cNvGrpSpPr/>
                         <wpg:grpSpPr>
                           <a:xfrm>
@@ -1455,8 +1279,8 @@
                           </a:xfrm>
                         </wpg:grpSpPr>
                         <wps:wsp>
+                          <wps:cNvPr id="636874687" name="Rectangle 636874687"/>
                           <wps:cNvSpPr/>
-                          <wps:cNvPr id="3" name="Shape 3"/>
                           <wps:spPr>
                             <a:xfrm>
                               <a:off x="0" y="0"/>
@@ -1474,30 +1298,33 @@
                             <w:txbxContent>
                               <w:p>
                                 <w:pPr>
-                                  <w:spacing w:after="0" w:before="0" w:line="240"/>
+                                  <w:spacing w:after="0" w:line="240" w:lineRule="auto"/>
                                   <w:ind w:left="0" w:right="0" w:firstLine="0"/>
-                                  <w:jc w:val="left"/>
                                   <w:textDirection w:val="btLr"/>
                                 </w:pPr>
                               </w:p>
                             </w:txbxContent>
                           </wps:txbx>
-                          <wps:bodyPr anchorCtr="0" anchor="ctr" bIns="91425" lIns="91425" spcFirstLastPara="1" rIns="91425" wrap="square" tIns="91425">
+                          <wps:bodyPr spcFirstLastPara="1" wrap="square" lIns="91425" tIns="91425" rIns="91425" bIns="91425" anchor="ctr" anchorCtr="0">
                             <a:noAutofit/>
                           </wps:bodyPr>
                         </wps:wsp>
                         <wps:wsp>
+                          <wps:cNvPr id="1908795693" name="Freeform 1908795693"/>
                           <wps:cNvSpPr/>
-                          <wps:cNvPr id="10" name="Shape 10"/>
                           <wps:spPr>
                             <a:xfrm>
                               <a:off x="0" y="0"/>
                               <a:ext cx="6895465" cy="9144"/>
                             </a:xfrm>
                             <a:custGeom>
-                              <a:rect b="b" l="l" r="r" t="t"/>
+                              <a:avLst/>
+                              <a:gdLst/>
+                              <a:ahLst/>
+                              <a:cxnLst/>
+                              <a:rect l="l" t="t" r="r" b="b"/>
                               <a:pathLst>
-                                <a:path extrusionOk="0" h="9144" w="6895465">
+                                <a:path w="6895465" h="9144" extrusionOk="0">
                                   <a:moveTo>
                                     <a:pt x="0" y="0"/>
                                   </a:moveTo>
@@ -1523,7 +1350,7 @@
                               <a:noFill/>
                             </a:ln>
                           </wps:spPr>
-                          <wps:bodyPr anchorCtr="0" anchor="ctr" bIns="91425" lIns="91425" spcFirstLastPara="1" rIns="91425" wrap="square" tIns="91425">
+                          <wps:bodyPr spcFirstLastPara="1" wrap="square" lIns="91425" tIns="91425" rIns="91425" bIns="91425" anchor="ctr" anchorCtr="0">
                             <a:noAutofit/>
                           </wps:bodyPr>
                         </wps:wsp>
@@ -1535,198 +1362,149 @@
             </w:drawing>
           </mc:Choice>
           <mc:Fallback>
-            <w:drawing>
-              <wp:inline distB="0" distT="0" distL="0" distR="0">
-                <wp:extent cx="6895465" cy="8636"/>
-                <wp:effectExtent b="0" l="0" r="0" t="0"/>
-                <wp:docPr id="1383" name="image4.png"/>
-                <a:graphic>
-                  <a:graphicData uri="http://schemas.openxmlformats.org/drawingml/2006/picture">
-                    <pic:pic>
-                      <pic:nvPicPr>
-                        <pic:cNvPr id="0" name="image4.png"/>
-                        <pic:cNvPicPr preferRelativeResize="0"/>
-                      </pic:nvPicPr>
-                      <pic:blipFill>
-                        <a:blip r:embed="rId7"/>
-                        <a:srcRect/>
-                        <a:stretch>
-                          <a:fillRect/>
-                        </a:stretch>
-                      </pic:blipFill>
-                      <pic:spPr>
-                        <a:xfrm>
-                          <a:off x="0" y="0"/>
-                          <a:ext cx="6895465" cy="8636"/>
-                        </a:xfrm>
-                        <a:prstGeom prst="rect"/>
-                        <a:ln/>
-                      </pic:spPr>
-                    </pic:pic>
-                  </a:graphicData>
-                </a:graphic>
-              </wp:inline>
-            </w:drawing>
+            <w:pict>
+              <v:group w14:anchorId="3006C77B" id="Group 1383" o:spid="_x0000_s1038" style="width:542.95pt;height:.7pt;mso-position-horizontal-relative:char;mso-position-vertical-relative:line" coordorigin="18982,37756" coordsize="68955,91" o:gfxdata="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">
+                <v:group id="Group 1677470627" o:spid="_x0000_s1039" style="position:absolute;left:18982;top:37756;width:68955;height:92" coordsize="68954,91" o:gfxdata="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">
+                  <v:rect id="Rectangle 636874687" o:spid="_x0000_s1040" style="position:absolute;width:68954;height:86;visibility:visible;mso-wrap-style:square;v-text-anchor:middle" o:gfxdata="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" filled="f" stroked="f">
+                    <v:textbox inset="2.53958mm,2.53958mm,2.53958mm,2.53958mm">
+                      <w:txbxContent>
+                        <w:p>
+                          <w:pPr>
+                            <w:spacing w:after="0" w:line="240" w:lineRule="auto"/>
+                            <w:ind w:left="0" w:right="0" w:firstLine="0"/>
+                            <w:textDirection w:val="btLr"/>
+                          </w:pPr>
+                        </w:p>
+                      </w:txbxContent>
+                    </v:textbox>
+                  </v:rect>
+                  <v:shape id="Freeform 1908795693" o:spid="_x0000_s1041" style="position:absolute;width:68954;height:91;visibility:visible;mso-wrap-style:square;v-text-anchor:middle" coordsize="6895465,9144" o:gfxdata="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" path="m,l6895465,r,9144l,9144,,e" fillcolor="black" stroked="f">
+                    <v:path arrowok="t" o:extrusionok="f"/>
+                  </v:shape>
+                </v:group>
+                <w10:anchorlock/>
+              </v:group>
+            </w:pict>
           </mc:Fallback>
         </mc:AlternateContent>
       </w:r>
       <w:r>
-        <w:rPr>
-          <w:rtl w:val="0"/>
-        </w:rPr>
         <w:t xml:space="preserve">  </w:t>
       </w:r>
-      <w:r>
-        <w:rPr>
-          <w:rtl w:val="0"/>
-        </w:rPr>
-      </w:r>
     </w:p>
     <w:p>
       <w:pPr>
         <w:ind w:left="40" w:right="111" w:firstLine="0"/>
-        <w:rPr/>
-      </w:pPr>
-      <w:r>
-        <w:rPr>
-          <w:b w:val="1"/>
-          <w:bCs w:val="1"/>
-          <w:rtl w:val="0"/>
-        </w:rPr>
-        <w:t xml:space="preserve">Front-End Technologies</w:t>
-      </w:r>
-      <w:r>
-        <w:rPr>
-          <w:rtl w:val="0"/>
-        </w:rPr>
-        <w:t xml:space="preserve">: React, React Native, HTML5, CSS3, JavaScript, Bootstrap, Sass</w:t>
+      </w:pPr>
+      <w:r>
+        <w:rPr>
+          <w:b/>
+          <w:bCs/>
+        </w:rPr>
+        <w:t>Front-End Technologies</w:t>
+      </w:r>
+      <w:r>
+        <w:t>: React, React Native, HTML5, CSS3, JavaScript, Bootstrap, Sass</w:t>
       </w:r>
     </w:p>
     <w:p>
       <w:pPr>
         <w:ind w:left="40" w:right="111" w:firstLine="0"/>
-        <w:rPr/>
-      </w:pPr>
-      <w:r>
-        <w:rPr>
-          <w:b w:val="1"/>
-          <w:bCs w:val="1"/>
-          <w:rtl w:val="0"/>
-        </w:rPr>
-        <w:t xml:space="preserve">Back-End Technologies</w:t>
-      </w:r>
-      <w:r>
-        <w:rPr>
-          <w:rtl w:val="0"/>
-        </w:rPr>
-        <w:t xml:space="preserve">: Node.js, Express.js, Java, Python (Django, Flask), RESTful APIs, GraphQL, Microservices</w:t>
+      </w:pPr>
+      <w:r>
+        <w:rPr>
+          <w:b/>
+          <w:bCs/>
+        </w:rPr>
+        <w:t>Back-End Technologies</w:t>
+      </w:r>
+      <w:r>
+        <w:t>: Node.js, Express.js, Java, Python (Django, Flask), RESTful APIs, GraphQL, Microservices</w:t>
       </w:r>
     </w:p>
     <w:p>
       <w:pPr>
         <w:ind w:left="40" w:right="111" w:firstLine="0"/>
-        <w:rPr/>
-      </w:pPr>
-      <w:r>
-        <w:rPr>
-          <w:b w:val="1"/>
-          <w:bCs w:val="1"/>
-          <w:rtl w:val="0"/>
-        </w:rPr>
-        <w:t xml:space="preserve">Databases</w:t>
-      </w:r>
-      <w:r>
-        <w:rPr>
-          <w:rtl w:val="0"/>
-        </w:rPr>
-        <w:t xml:space="preserve">: MySQL, PostgreSQL, MongoDB, Firebase, DynamoDB, Redis, Elasticsearch</w:t>
+      </w:pPr>
+      <w:r>
+        <w:rPr>
+          <w:b/>
+          <w:bCs/>
+        </w:rPr>
+        <w:t>Databases</w:t>
+      </w:r>
+      <w:r>
+        <w:t>: MySQL, PostgreSQL, MongoDB, Firebase, DynamoDB, Redis, Elasticsearch</w:t>
       </w:r>
     </w:p>
     <w:p>
       <w:pPr>
         <w:ind w:left="40" w:right="111" w:firstLine="0"/>
-        <w:rPr/>
-      </w:pPr>
-      <w:r>
-        <w:rPr>
-          <w:b w:val="1"/>
-          <w:bCs w:val="1"/>
-          <w:rtl w:val="0"/>
-        </w:rPr>
-        <w:t xml:space="preserve">Cloud &amp; Infrastructure</w:t>
-      </w:r>
-      <w:r>
-        <w:rPr>
-          <w:rtl w:val="0"/>
-        </w:rPr>
+      </w:pPr>
+      <w:r>
+        <w:rPr>
+          <w:b/>
+          <w:bCs/>
+        </w:rPr>
+        <w:t>Cloud &amp; Infrastructure</w:t>
+      </w:r>
+      <w:r>
         <w:t xml:space="preserve">: </w:t>
       </w:r>
       <w:r>
         <w:rPr>
           <w:sz w:val="20"/>
           <w:szCs w:val="20"/>
-          <w:rtl w:val="0"/>
-        </w:rPr>
-        <w:t xml:space="preserve">AWS, Google Cloud, Docker, Kubernetes, Nginx, Jenkins, CI/CD Pipelines</w:t>
-      </w:r>
-      <w:r>
-        <w:rPr>
-          <w:rtl w:val="0"/>
-        </w:rPr>
+        </w:rPr>
+        <w:t>AWS, Google Cloud, Docker, Kubernetes, Nginx, Jenkins, CI/CD Pipelines</w:t>
       </w:r>
     </w:p>
     <w:p>
       <w:pPr>
         <w:ind w:left="40" w:right="111" w:firstLine="0"/>
-        <w:rPr/>
-      </w:pPr>
-      <w:r>
-        <w:rPr>
-          <w:b w:val="1"/>
-          <w:bCs w:val="1"/>
-          <w:rtl w:val="0"/>
-        </w:rPr>
-        <w:t xml:space="preserve">Testing &amp; Debugging</w:t>
-      </w:r>
-      <w:r>
-        <w:rPr>
-          <w:rtl w:val="0"/>
-        </w:rPr>
-        <w:t xml:space="preserve">: Jest, Mocha, Cypress</w:t>
+      </w:pPr>
+      <w:r>
+        <w:rPr>
+          <w:b/>
+          <w:bCs/>
+        </w:rPr>
+        <w:t>Testing &amp; Debugging</w:t>
+      </w:r>
+      <w:r>
+        <w:t>: Jest, Mocha, Cypress</w:t>
       </w:r>
     </w:p>
     <w:p>
       <w:pPr>
         <w:ind w:left="40" w:right="111" w:firstLine="0"/>
-        <w:rPr/>
-      </w:pPr>
-      <w:r>
-        <w:rPr>
-          <w:b w:val="1"/>
-          <w:bCs w:val="1"/>
-          <w:rtl w:val="0"/>
-        </w:rPr>
-        <w:t xml:space="preserve">Tools &amp; Frameworks</w:t>
-      </w:r>
-      <w:r>
-        <w:rPr>
-          <w:rtl w:val="0"/>
-        </w:rPr>
-        <w:t xml:space="preserve">: Kafka, Grafana, Pandas, OSGi, Appsflyer, Airtable</w:t>
+      </w:pPr>
+      <w:r>
+        <w:rPr>
+          <w:b/>
+          <w:bCs/>
+        </w:rPr>
+        <w:t>Tools &amp; Frameworks</w:t>
+      </w:r>
+      <w:r>
+        <w:t>: Kafka, Grafana, Pandas, OSGi, Appsflyer, Airtable</w:t>
       </w:r>
     </w:p>
     <w:sectPr>
-      <w:pgSz w:h="15840" w:w="12240" w:orient="portrait"/>
-      <w:pgMar w:bottom="1440" w:top="1440" w:left="691" w:right="512" w:header="720" w:footer="720"/>
+      <w:pgSz w:w="12240" w:h="15840"/>
+      <w:pgMar w:top="1440" w:right="512" w:bottom="1440" w:left="691" w:header="720" w:footer="720" w:gutter="0"/>
       <w:pgNumType w:start="1"/>
+      <w:cols w:space="720"/>
     </w:sectPr>
   </w:body>
 </w:document>
 </file>
 
 <file path=word/numbering.xml><?xml version="1.0" encoding="utf-8"?>
-<w:numbering xmlns:mc="http://schemas.openxmlformats.org/markup-compatibility/2006" xmlns:o="urn:schemas-microsoft-com:office:office" xmlns:r="http://schemas.openxmlformats.org/officeDocument/2006/relationships" xmlns:m="http://schemas.openxmlformats.org/officeDocument/2006/math" xmlns:v="urn:schemas-microsoft-com:vml" xmlns:wp="http://schemas.openxmlformats.org/drawingml/2006/wordprocessingDrawing" xmlns:w10="urn:schemas-microsoft-com:office:word" xmlns:w="http://schemas.openxmlformats.org/wordprocessingml/2006/main" xmlns:wne="http://schemas.microsoft.com/office/word/2006/wordml" xmlns:sl="http://schemas.openxmlformats.org/schemaLibrary/2006/main" xmlns:a="http://schemas.openxmlformats.org/drawingml/2006/main" xmlns:pic="http://schemas.openxmlformats.org/drawingml/2006/picture" xmlns:c="http://schemas.openxmlformats.org/drawingml/2006/chart" xmlns:lc="http://schemas.openxmlformats.org/drawingml/2006/lockedCanvas" xmlns:dgm="http://schemas.openxmlformats.org/drawingml/2006/diagram" xmlns:wps="http://schemas.microsoft.com/office/word/2010/wordprocessingShape" xmlns:wpg="http://schemas.microsoft.com/office/word/2010/wordprocessingGroup" xmlns:w14="http://schemas.microsoft.com/office/word/2010/wordml" xmlns:w15="http://schemas.microsoft.com/office/word/2012/wordml" xmlns:w16="http://schemas.microsoft.com/office/word/2018/wordml" xmlns:w16cex="http://schemas.microsoft.com/office/word/2018/wordml/cex" xmlns:w16cid="http://schemas.microsoft.com/office/word/2016/wordml/cid" xmlns="http://schemas.microsoft.com/office/tasks/2019/documenttasks" xmlns:cr="http://schemas.microsoft.com/office/comments/2020/reactions">
-  <w:abstractNum w:abstractNumId="1">
+<w:numbering xmlns:wpc="http://schemas.microsoft.com/office/word/2010/wordprocessingCanvas" xmlns:cx="http://schemas.microsoft.com/office/drawing/2014/chartex" xmlns:cx1="http://schemas.microsoft.com/office/drawing/2015/9/8/chartex" xmlns:cx2="http://schemas.microsoft.com/office/drawing/2015/10/21/chartex" xmlns:cx3="http://schemas.microsoft.com/office/drawing/2016/5/9/chartex" xmlns:cx4="http://schemas.microsoft.com/office/drawing/2016/5/10/chartex" xmlns:cx5="http://schemas.microsoft.com/office/drawing/2016/5/11/chartex" xmlns:cx6="http://schemas.microsoft.com/office/drawing/2016/5/12/chartex" xmlns:cx7="http://schemas.microsoft.com/office/drawing/2016/5/13/chartex" xmlns:cx8="http://schemas.microsoft.com/office/drawing/2016/5/14/chartex" xmlns:mc="http://schemas.openxmlformats.org/markup-compatibility/2006" xmlns:m="http://schemas.openxmlformats.org/officeDocument/2006/math" xmlns:aink="http://schemas.microsoft.com/office/drawing/2016/ink" xmlns:am3d="http://schemas.microsoft.com/office/drawing/2017/model3d" xmlns:oel="http://schemas.microsoft.com/office/2019/extlst" xmlns:r="http://schemas.openxmlformats.org/officeDocument/2006/relationships" xmlns:wp14="http://schemas.microsoft.com/office/word/2010/wordprocessingDrawing" xmlns:wp="http://schemas.openxmlformats.org/drawingml/2006/wordprocessingDrawing" xmlns:wpg="http://schemas.microsoft.com/office/word/2010/wordprocessingGroup" xmlns:wpi="http://schemas.microsoft.com/office/word/2010/wordprocessingInk" xmlns:wps="http://schemas.microsoft.com/office/word/2010/wordprocessingShape" xmlns:o="urn:schemas-microsoft-com:office:office" xmlns:v="urn:schemas-microsoft-com:vml" xmlns:w10="urn:schemas-microsoft-com:office:word" xmlns:w="http://schemas.openxmlformats.org/wordprocessingml/2006/main" xmlns:w14="http://schemas.microsoft.com/office/word/2010/wordml" xmlns:w15="http://schemas.microsoft.com/office/word/2012/wordml" xmlns:w16cex="http://schemas.microsoft.com/office/word/2018/wordml/cex" xmlns:w16cid="http://schemas.microsoft.com/office/word/2016/wordml/cid" xmlns:w16="http://schemas.microsoft.com/office/word/2018/wordml" xmlns:w16sdtdh="http://schemas.microsoft.com/office/word/2020/wordml/sdtdatahash" xmlns:w16sdtfl="http://schemas.microsoft.com/office/word/2024/wordml/sdtformatlock" xmlns:w16se="http://schemas.microsoft.com/office/word/2015/wordml/symex" xmlns:w16du="http://schemas.microsoft.com/office/word/2023/wordml/word16du" xmlns:wne="http://schemas.microsoft.com/office/word/2006/wordml" mc:Ignorable="w14 w15 w16se w16cid w16 w16cex w16sdtdh w16sdtfl w16du wp14">
+  <w:abstractNum w:abstractNumId="0" w15:restartNumberingAfterBreak="0">
+    <w:nsid w:val="0DF46CCA"/>
+    <w:multiLevelType w:val="multilevel"/>
+    <w:tmpl w:val="1E66A8C6"/>
     <w:lvl w:ilvl="0">
       <w:start w:val="1"/>
       <w:numFmt w:val="bullet"/>
@@ -1736,7 +1514,7 @@
         <w:ind w:left="705" w:hanging="705"/>
       </w:pPr>
       <w:rPr>
-        <w:rFonts w:ascii="Arial" w:cs="Arial" w:eastAsia="Arial" w:hAnsi="Arial"/>
+        <w:rFonts w:ascii="Arial" w:eastAsia="Arial" w:hAnsi="Arial" w:cs="Arial"/>
         <w:b w:val="0"/>
         <w:bCs w:val="0"/>
         <w:i w:val="0"/>
@@ -1746,7 +1524,7 @@
         <w:sz w:val="21"/>
         <w:szCs w:val="21"/>
         <w:u w:val="none"/>
-        <w:shd w:fill="auto" w:val="clear"/>
+        <w:shd w:val="clear" w:color="auto" w:fill="auto"/>
         <w:vertAlign w:val="baseline"/>
       </w:rPr>
     </w:lvl>
@@ -1759,7 +1537,7 @@
         <w:ind w:left="1440" w:hanging="1440"/>
       </w:pPr>
       <w:rPr>
-        <w:rFonts w:ascii="Arial" w:cs="Arial" w:eastAsia="Arial" w:hAnsi="Arial"/>
+        <w:rFonts w:ascii="Arial" w:eastAsia="Arial" w:hAnsi="Arial" w:cs="Arial"/>
         <w:b w:val="0"/>
         <w:bCs w:val="0"/>
         <w:i w:val="0"/>
@@ -1769,7 +1547,7 @@
         <w:sz w:val="21"/>
         <w:szCs w:val="21"/>
         <w:u w:val="none"/>
-        <w:shd w:fill="auto" w:val="clear"/>
+        <w:shd w:val="clear" w:color="auto" w:fill="auto"/>
         <w:vertAlign w:val="baseline"/>
       </w:rPr>
     </w:lvl>
@@ -1782,7 +1560,7 @@
         <w:ind w:left="2160" w:hanging="2160"/>
       </w:pPr>
       <w:rPr>
-        <w:rFonts w:ascii="Arial" w:cs="Arial" w:eastAsia="Arial" w:hAnsi="Arial"/>
+        <w:rFonts w:ascii="Arial" w:eastAsia="Arial" w:hAnsi="Arial" w:cs="Arial"/>
         <w:b w:val="0"/>
         <w:bCs w:val="0"/>
         <w:i w:val="0"/>
@@ -1792,7 +1570,7 @@
         <w:sz w:val="21"/>
         <w:szCs w:val="21"/>
         <w:u w:val="none"/>
-        <w:shd w:fill="auto" w:val="clear"/>
+        <w:shd w:val="clear" w:color="auto" w:fill="auto"/>
         <w:vertAlign w:val="baseline"/>
       </w:rPr>
     </w:lvl>
@@ -1805,7 +1583,7 @@
         <w:ind w:left="2880" w:hanging="2880"/>
       </w:pPr>
       <w:rPr>
-        <w:rFonts w:ascii="Arial" w:cs="Arial" w:eastAsia="Arial" w:hAnsi="Arial"/>
+        <w:rFonts w:ascii="Arial" w:eastAsia="Arial" w:hAnsi="Arial" w:cs="Arial"/>
         <w:b w:val="0"/>
         <w:bCs w:val="0"/>
         <w:i w:val="0"/>
@@ -1815,7 +1593,7 @@
         <w:sz w:val="21"/>
         <w:szCs w:val="21"/>
         <w:u w:val="none"/>
-        <w:shd w:fill="auto" w:val="clear"/>
+        <w:shd w:val="clear" w:color="auto" w:fill="auto"/>
         <w:vertAlign w:val="baseline"/>
       </w:rPr>
     </w:lvl>
@@ -1828,7 +1606,7 @@
         <w:ind w:left="3600" w:hanging="3600"/>
       </w:pPr>
       <w:rPr>
-        <w:rFonts w:ascii="Arial" w:cs="Arial" w:eastAsia="Arial" w:hAnsi="Arial"/>
+        <w:rFonts w:ascii="Arial" w:eastAsia="Arial" w:hAnsi="Arial" w:cs="Arial"/>
         <w:b w:val="0"/>
         <w:bCs w:val="0"/>
         <w:i w:val="0"/>
@@ -1838,7 +1616,7 @@
         <w:sz w:val="21"/>
         <w:szCs w:val="21"/>
         <w:u w:val="none"/>
-        <w:shd w:fill="auto" w:val="clear"/>
+        <w:shd w:val="clear" w:color="auto" w:fill="auto"/>
         <w:vertAlign w:val="baseline"/>
       </w:rPr>
     </w:lvl>
@@ -1851,7 +1629,7 @@
         <w:ind w:left="4320" w:hanging="4320"/>
       </w:pPr>
       <w:rPr>
-        <w:rFonts w:ascii="Arial" w:cs="Arial" w:eastAsia="Arial" w:hAnsi="Arial"/>
+        <w:rFonts w:ascii="Arial" w:eastAsia="Arial" w:hAnsi="Arial" w:cs="Arial"/>
         <w:b w:val="0"/>
         <w:bCs w:val="0"/>
         <w:i w:val="0"/>
@@ -1861,7 +1639,7 @@
         <w:sz w:val="21"/>
         <w:szCs w:val="21"/>
         <w:u w:val="none"/>
-        <w:shd w:fill="auto" w:val="clear"/>
+        <w:shd w:val="clear" w:color="auto" w:fill="auto"/>
         <w:vertAlign w:val="baseline"/>
       </w:rPr>
     </w:lvl>
@@ -1874,7 +1652,7 @@
         <w:ind w:left="5040" w:hanging="5040"/>
       </w:pPr>
       <w:rPr>
-        <w:rFonts w:ascii="Arial" w:cs="Arial" w:eastAsia="Arial" w:hAnsi="Arial"/>
+        <w:rFonts w:ascii="Arial" w:eastAsia="Arial" w:hAnsi="Arial" w:cs="Arial"/>
         <w:b w:val="0"/>
         <w:bCs w:val="0"/>
         <w:i w:val="0"/>
@@ -1884,7 +1662,7 @@
         <w:sz w:val="21"/>
         <w:szCs w:val="21"/>
         <w:u w:val="none"/>
-        <w:shd w:fill="auto" w:val="clear"/>
+        <w:shd w:val="clear" w:color="auto" w:fill="auto"/>
         <w:vertAlign w:val="baseline"/>
       </w:rPr>
     </w:lvl>
@@ -1897,7 +1675,7 @@
         <w:ind w:left="5760" w:hanging="5760"/>
       </w:pPr>
       <w:rPr>
-        <w:rFonts w:ascii="Arial" w:cs="Arial" w:eastAsia="Arial" w:hAnsi="Arial"/>
+        <w:rFonts w:ascii="Arial" w:eastAsia="Arial" w:hAnsi="Arial" w:cs="Arial"/>
         <w:b w:val="0"/>
         <w:bCs w:val="0"/>
         <w:i w:val="0"/>
@@ -1907,7 +1685,7 @@
         <w:sz w:val="21"/>
         <w:szCs w:val="21"/>
         <w:u w:val="none"/>
-        <w:shd w:fill="auto" w:val="clear"/>
+        <w:shd w:val="clear" w:color="auto" w:fill="auto"/>
         <w:vertAlign w:val="baseline"/>
       </w:rPr>
     </w:lvl>
@@ -1920,7 +1698,7 @@
         <w:ind w:left="6480" w:hanging="6480"/>
       </w:pPr>
       <w:rPr>
-        <w:rFonts w:ascii="Arial" w:cs="Arial" w:eastAsia="Arial" w:hAnsi="Arial"/>
+        <w:rFonts w:ascii="Arial" w:eastAsia="Arial" w:hAnsi="Arial" w:cs="Arial"/>
         <w:b w:val="0"/>
         <w:bCs w:val="0"/>
         <w:i w:val="0"/>
@@ -1930,99 +1708,460 @@
         <w:sz w:val="21"/>
         <w:szCs w:val="21"/>
         <w:u w:val="none"/>
-        <w:shd w:fill="auto" w:val="clear"/>
+        <w:shd w:val="clear" w:color="auto" w:fill="auto"/>
         <w:vertAlign w:val="baseline"/>
       </w:rPr>
     </w:lvl>
   </w:abstractNum>
-  <w:num w:numId="1">
-    <w:abstractNumId w:val="1"/>
+  <w:num w:numId="1" w16cid:durableId="1551267161">
+    <w:abstractNumId w:val="0"/>
   </w:num>
 </w:numbering>
 </file>
 
 <file path=word/styles.xml><?xml version="1.0" encoding="utf-8"?>
-<w:styles xmlns:mc="http://schemas.openxmlformats.org/markup-compatibility/2006" xmlns:o="urn:schemas-microsoft-com:office:office" xmlns:r="http://schemas.openxmlformats.org/officeDocument/2006/relationships" xmlns:m="http://schemas.openxmlformats.org/officeDocument/2006/math" xmlns:v="urn:schemas-microsoft-com:vml" xmlns:wp="http://schemas.openxmlformats.org/drawingml/2006/wordprocessingDrawing" xmlns:w10="urn:schemas-microsoft-com:office:word" xmlns:w="http://schemas.openxmlformats.org/wordprocessingml/2006/main" xmlns:wne="http://schemas.microsoft.com/office/word/2006/wordml" xmlns:sl="http://schemas.openxmlformats.org/schemaLibrary/2006/main" xmlns:a="http://schemas.openxmlformats.org/drawingml/2006/main" xmlns:pic="http://schemas.openxmlformats.org/drawingml/2006/picture" xmlns:c="http://schemas.openxmlformats.org/drawingml/2006/chart" xmlns:lc="http://schemas.openxmlformats.org/drawingml/2006/lockedCanvas" xmlns:dgm="http://schemas.openxmlformats.org/drawingml/2006/diagram" xmlns:wps="http://schemas.microsoft.com/office/word/2010/wordprocessingShape" xmlns:wpg="http://schemas.microsoft.com/office/word/2010/wordprocessingGroup" xmlns:w14="http://schemas.microsoft.com/office/word/2010/wordml" xmlns:w15="http://schemas.microsoft.com/office/word/2012/wordml" xmlns:w16="http://schemas.microsoft.com/office/word/2018/wordml" xmlns:w16cex="http://schemas.microsoft.com/office/word/2018/wordml/cex" xmlns:w16cid="http://schemas.microsoft.com/office/word/2016/wordml/cid" xmlns="http://schemas.microsoft.com/office/tasks/2019/documenttasks" xmlns:cr="http://schemas.microsoft.com/office/comments/2020/reactions">
+<w:styles xmlns:mc="http://schemas.openxmlformats.org/markup-compatibility/2006" xmlns:r="http://schemas.openxmlformats.org/officeDocument/2006/relationships" xmlns:w="http://schemas.openxmlformats.org/wordprocessingml/2006/main" xmlns:w14="http://schemas.microsoft.com/office/word/2010/wordml" xmlns:w15="http://schemas.microsoft.com/office/word/2012/wordml" xmlns:w16cex="http://schemas.microsoft.com/office/word/2018/wordml/cex" xmlns:w16cid="http://schemas.microsoft.com/office/word/2016/wordml/cid" xmlns:w16="http://schemas.microsoft.com/office/word/2018/wordml" xmlns:w16sdtdh="http://schemas.microsoft.com/office/word/2020/wordml/sdtdatahash" xmlns:w16sdtfl="http://schemas.microsoft.com/office/word/2024/wordml/sdtformatlock" xmlns:w16se="http://schemas.microsoft.com/office/word/2015/wordml/symex" xmlns:w16du="http://schemas.microsoft.com/office/word/2023/wordml/word16du" mc:Ignorable="w14 w15 w16se w16cid w16 w16cex w16sdtdh w16sdtfl w16du">
   <w:docDefaults>
     <w:rPrDefault>
       <w:rPr>
-        <w:rFonts w:ascii="Arial" w:cs="Arial" w:eastAsia="Arial" w:hAnsi="Arial"/>
+        <w:rFonts w:ascii="Arial" w:eastAsia="Arial" w:hAnsi="Arial" w:cs="Arial"/>
         <w:sz w:val="21"/>
         <w:szCs w:val="21"/>
-        <w:lang w:val="en-US"/>
+        <w:lang w:val="en-US" w:eastAsia="en-US" w:bidi="ar-SA"/>
       </w:rPr>
     </w:rPrDefault>
     <w:pPrDefault>
       <w:pPr>
-        <w:spacing w:after="4" w:line="261.99999999999994" w:lineRule="auto"/>
+        <w:spacing w:after="4" w:line="261" w:lineRule="auto"/>
         <w:ind w:left="10" w:right="182"/>
       </w:pPr>
     </w:pPrDefault>
   </w:docDefaults>
-  <w:style w:type="table" w:styleId="TableNormal" w:default="1">
-    <w:name w:val="TableNormal"/>
-    <w:tblPr>
-      <w:tblCellMar>
-        <w:top w:w="100.0" w:type="dxa"/>
-        <w:left w:w="100.0" w:type="dxa"/>
-        <w:bottom w:w="100.0" w:type="dxa"/>
-        <w:right w:w="100.0" w:type="dxa"/>
-      </w:tblCellMar>
-    </w:tblPr>
-  </w:style>
-  <w:style w:type="paragraph" w:styleId="Normal" w:default="1">
-    <w:name w:val="normal"/>
+  <w:latentStyles w:defLockedState="0" w:defUIPriority="99" w:defSemiHidden="0" w:defUnhideWhenUsed="0" w:defQFormat="0" w:count="376">
+    <w:lsdException w:name="Normal" w:uiPriority="0" w:qFormat="1"/>
+    <w:lsdException w:name="heading 1" w:uiPriority="9" w:qFormat="1"/>
+    <w:lsdException w:name="heading 2" w:semiHidden="1" w:uiPriority="9" w:unhideWhenUsed="1" w:qFormat="1"/>
+    <w:lsdException w:name="heading 3" w:semiHidden="1" w:uiPriority="9" w:unhideWhenUsed="1" w:qFormat="1"/>
+    <w:lsdException w:name="heading 4" w:semiHidden="1" w:uiPriority="9" w:unhideWhenUsed="1" w:qFormat="1"/>
+    <w:lsdException w:name="heading 5" w:semiHidden="1" w:uiPriority="9" w:unhideWhenUsed="1" w:qFormat="1"/>
+    <w:lsdException w:name="heading 6" w:semiHidden="1" w:uiPriority="9" w:unhideWhenUsed="1" w:qFormat="1"/>
+    <w:lsdException w:name="heading 7" w:semiHidden="1" w:uiPriority="9" w:unhideWhenUsed="1" w:qFormat="1"/>
+    <w:lsdException w:name="heading 8" w:semiHidden="1" w:uiPriority="9" w:unhideWhenUsed="1" w:qFormat="1"/>
+    <w:lsdException w:name="heading 9" w:semiHidden="1" w:uiPriority="9" w:unhideWhenUsed="1" w:qFormat="1"/>
+    <w:lsdException w:name="index 1" w:semiHidden="1" w:unhideWhenUsed="1"/>
+    <w:lsdException w:name="index 2" w:semiHidden="1" w:unhideWhenUsed="1"/>
+    <w:lsdException w:name="index 3" w:semiHidden="1" w:unhideWhenUsed="1"/>
+    <w:lsdException w:name="index 4" w:semiHidden="1" w:unhideWhenUsed="1"/>
+    <w:lsdException w:name="index 5" w:semiHidden="1" w:unhideWhenUsed="1"/>
+    <w:lsdException w:name="index 6" w:semiHidden="1" w:unhideWhenUsed="1"/>
+    <w:lsdException w:name="index 7" w:semiHidden="1" w:unhideWhenUsed="1"/>
+    <w:lsdException w:name="index 8" w:semiHidden="1" w:unhideWhenUsed="1"/>
+    <w:lsdException w:name="index 9" w:semiHidden="1" w:unhideWhenUsed="1"/>
+    <w:lsdException w:name="toc 1" w:semiHidden="1" w:uiPriority="39" w:unhideWhenUsed="1"/>
+    <w:lsdException w:name="toc 2" w:semiHidden="1" w:uiPriority="39" w:unhideWhenUsed="1"/>
+    <w:lsdException w:name="toc 3" w:semiHidden="1" w:uiPriority="39" w:unhideWhenUsed="1"/>
+    <w:lsdException w:name="toc 4" w:semiHidden="1" w:uiPriority="39" w:unhideWhenUsed="1"/>
+    <w:lsdException w:name="toc 5" w:semiHidden="1" w:uiPriority="39" w:unhideWhenUsed="1"/>
+    <w:lsdException w:name="toc 6" w:semiHidden="1" w:uiPriority="39" w:unhideWhenUsed="1"/>
+    <w:lsdException w:name="toc 7" w:semiHidden="1" w:uiPriority="39" w:unhideWhenUsed="1"/>
+    <w:lsdException w:name="toc 8" w:semiHidden="1" w:uiPriority="39" w:unhideWhenUsed="1"/>
+    <w:lsdException w:name="toc 9" w:semiHidden="1" w:uiPriority="39" w:unhideWhenUsed="1"/>
+    <w:lsdException w:name="Normal Indent" w:semiHidden="1" w:unhideWhenUsed="1"/>
+    <w:lsdException w:name="footnote text" w:semiHidden="1" w:unhideWhenUsed="1"/>
+    <w:lsdException w:name="annotation text" w:semiHidden="1" w:unhideWhenUsed="1"/>
+    <w:lsdException w:name="header" w:semiHidden="1" w:unhideWhenUsed="1"/>
+    <w:lsdException w:name="footer" w:semiHidden="1" w:unhideWhenUsed="1"/>
+    <w:lsdException w:name="index heading" w:semiHidden="1" w:unhideWhenUsed="1"/>
+    <w:lsdException w:name="caption" w:semiHidden="1" w:uiPriority="35" w:unhideWhenUsed="1" w:qFormat="1"/>
+    <w:lsdException w:name="table of figures" w:semiHidden="1" w:unhideWhenUsed="1"/>
+    <w:lsdException w:name="envelope address" w:semiHidden="1" w:unhideWhenUsed="1"/>
+    <w:lsdException w:name="envelope return" w:semiHidden="1" w:unhideWhenUsed="1"/>
+    <w:lsdException w:name="footnote reference" w:semiHidden="1" w:unhideWhenUsed="1"/>
+    <w:lsdException w:name="annotation reference" w:semiHidden="1" w:unhideWhenUsed="1"/>
+    <w:lsdException w:name="line number" w:semiHidden="1" w:unhideWhenUsed="1"/>
+    <w:lsdException w:name="page number" w:semiHidden="1" w:unhideWhenUsed="1"/>
+    <w:lsdException w:name="endnote reference" w:semiHidden="1" w:unhideWhenUsed="1"/>
+    <w:lsdException w:name="endnote text" w:semiHidden="1" w:unhideWhenUsed="1"/>
+    <w:lsdException w:name="table of authorities" w:semiHidden="1" w:unhideWhenUsed="1"/>
+    <w:lsdException w:name="macro" w:semiHidden="1" w:unhideWhenUsed="1"/>
+    <w:lsdException w:name="toa heading" w:semiHidden="1" w:unhideWhenUsed="1"/>
+    <w:lsdException w:name="List" w:semiHidden="1" w:unhideWhenUsed="1"/>
+    <w:lsdException w:name="List Bullet" w:semiHidden="1" w:unhideWhenUsed="1"/>
+    <w:lsdException w:name="List Number" w:semiHidden="1" w:unhideWhenUsed="1"/>
+    <w:lsdException w:name="List 2" w:semiHidden="1" w:unhideWhenUsed="1"/>
+    <w:lsdException w:name="List 3" w:semiHidden="1" w:unhideWhenUsed="1"/>
+    <w:lsdException w:name="List 4" w:semiHidden="1" w:unhideWhenUsed="1"/>
+    <w:lsdException w:name="List 5" w:semiHidden="1" w:unhideWhenUsed="1"/>
+    <w:lsdException w:name="List Bullet 2" w:semiHidden="1" w:unhideWhenUsed="1"/>
+    <w:lsdException w:name="List Bullet 3" w:semiHidden="1" w:unhideWhenUsed="1"/>
+    <w:lsdException w:name="List Bullet 4" w:semiHidden="1" w:unhideWhenUsed="1"/>
+    <w:lsdException w:name="List Bullet 5" w:semiHidden="1" w:unhideWhenUsed="1"/>
+    <w:lsdException w:name="List Number 2" w:semiHidden="1" w:unhideWhenUsed="1"/>
+    <w:lsdException w:name="List Number 3" w:semiHidden="1" w:unhideWhenUsed="1"/>
+    <w:lsdException w:name="List Number 4" w:semiHidden="1" w:unhideWhenUsed="1"/>
+    <w:lsdException w:name="List Number 5" w:semiHidden="1" w:unhideWhenUsed="1"/>
+    <w:lsdException w:name="Title" w:uiPriority="10" w:qFormat="1"/>
+    <w:lsdException w:name="Closing" w:semiHidden="1" w:unhideWhenUsed="1"/>
+    <w:lsdException w:name="Signature" w:semiHidden="1" w:unhideWhenUsed="1"/>
+    <w:lsdException w:name="Default Paragraph Font" w:semiHidden="1" w:uiPriority="1" w:unhideWhenUsed="1"/>
+    <w:lsdException w:name="Body Text" w:semiHidden="1" w:unhideWhenUsed="1"/>
+    <w:lsdException w:name="Body Text Indent" w:semiHidden="1" w:unhideWhenUsed="1"/>
+    <w:lsdException w:name="List Continue" w:semiHidden="1" w:unhideWhenUsed="1"/>
+    <w:lsdException w:name="List Continue 2" w:semiHidden="1" w:unhideWhenUsed="1"/>
+    <w:lsdException w:name="List Continue 3" w:semiHidden="1" w:unhideWhenUsed="1"/>
+    <w:lsdException w:name="List Continue 4" w:semiHidden="1" w:unhideWhenUsed="1"/>
+    <w:lsdException w:name="List Continue 5" w:semiHidden="1" w:unhideWhenUsed="1"/>
+    <w:lsdException w:name="Message Header" w:semiHidden="1" w:unhideWhenUsed="1"/>
+    <w:lsdException w:name="Subtitle" w:uiPriority="11" w:qFormat="1"/>
+    <w:lsdException w:name="Salutation" w:semiHidden="1" w:unhideWhenUsed="1"/>
+    <w:lsdException w:name="Date" w:semiHidden="1" w:unhideWhenUsed="1"/>
+    <w:lsdException w:name="Body Text First Indent" w:semiHidden="1" w:unhideWhenUsed="1"/>
+    <w:lsdException w:name="Body Text First Indent 2" w:semiHidden="1" w:unhideWhenUsed="1"/>
+    <w:lsdException w:name="Note Heading" w:semiHidden="1" w:unhideWhenUsed="1"/>
+    <w:lsdException w:name="Body Text 2" w:semiHidden="1" w:unhideWhenUsed="1"/>
+    <w:lsdException w:name="Body Text 3" w:semiHidden="1" w:unhideWhenUsed="1"/>
+    <w:lsdException w:name="Body Text Indent 2" w:semiHidden="1" w:unhideWhenUsed="1"/>
+    <w:lsdException w:name="Body Text Indent 3" w:semiHidden="1" w:unhideWhenUsed="1"/>
+    <w:lsdException w:name="Block Text" w:semiHidden="1" w:unhideWhenUsed="1"/>
+    <w:lsdException w:name="Hyperlink" w:semiHidden="1" w:unhideWhenUsed="1"/>
+    <w:lsdException w:name="FollowedHyperlink" w:semiHidden="1" w:unhideWhenUsed="1"/>
+    <w:lsdException w:name="Strong" w:uiPriority="22" w:qFormat="1"/>
+    <w:lsdException w:name="Emphasis" w:uiPriority="20" w:qFormat="1"/>
+    <w:lsdException w:name="Document Map" w:semiHidden="1" w:unhideWhenUsed="1"/>
+    <w:lsdException w:name="Plain Text" w:semiHidden="1" w:unhideWhenUsed="1"/>
+    <w:lsdException w:name="E-mail Signature" w:semiHidden="1" w:unhideWhenUsed="1"/>
+    <w:lsdException w:name="HTML Top of Form" w:semiHidden="1" w:unhideWhenUsed="1"/>
+    <w:lsdException w:name="HTML Bottom of Form" w:semiHidden="1" w:unhideWhenUsed="1"/>
+    <w:lsdException w:name="Normal (Web)" w:semiHidden="1" w:unhideWhenUsed="1"/>
+    <w:lsdException w:name="HTML Acronym" w:semiHidden="1" w:unhideWhenUsed="1"/>
+    <w:lsdException w:name="HTML Address" w:semiHidden="1" w:unhideWhenUsed="1"/>
+    <w:lsdException w:name="HTML Cite" w:semiHidden="1" w:unhideWhenUsed="1"/>
+    <w:lsdException w:name="HTML Code" w:semiHidden="1" w:unhideWhenUsed="1"/>
+    <w:lsdException w:name="HTML Definition" w:semiHidden="1" w:unhideWhenUsed="1"/>
+    <w:lsdException w:name="HTML Keyboard" w:semiHidden="1" w:unhideWhenUsed="1"/>
+    <w:lsdException w:name="HTML Preformatted" w:semiHidden="1" w:unhideWhenUsed="1"/>
+    <w:lsdException w:name="HTML Sample" w:semiHidden="1" w:unhideWhenUsed="1"/>
+    <w:lsdException w:name="HTML Typewriter" w:semiHidden="1" w:unhideWhenUsed="1"/>
+    <w:lsdException w:name="HTML Variable" w:semiHidden="1" w:unhideWhenUsed="1"/>
+    <w:lsdException w:name="Normal Table" w:semiHidden="1" w:unhideWhenUsed="1"/>
+    <w:lsdException w:name="annotation subject" w:semiHidden="1" w:unhideWhenUsed="1"/>
+    <w:lsdException w:name="No List" w:semiHidden="1" w:unhideWhenUsed="1"/>
+    <w:lsdException w:name="Outline List 1" w:semiHidden="1" w:unhideWhenUsed="1"/>
+    <w:lsdException w:name="Outline List 2" w:semiHidden="1" w:unhideWhenUsed="1"/>
+    <w:lsdException w:name="Outline List 3" w:semiHidden="1" w:unhideWhenUsed="1"/>
+    <w:lsdException w:name="Table Simple 1" w:semiHidden="1" w:unhideWhenUsed="1"/>
+    <w:lsdException w:name="Table Simple 2" w:semiHidden="1" w:unhideWhenUsed="1"/>
+    <w:lsdException w:name="Table Simple 3" w:semiHidden="1" w:unhideWhenUsed="1"/>
+    <w:lsdException w:name="Table Classic 1" w:semiHidden="1" w:unhideWhenUsed="1"/>
+    <w:lsdException w:name="Table Classic 2" w:semiHidden="1" w:unhideWhenUsed="1"/>
+    <w:lsdException w:name="Table Classic 3" w:semiHidden="1" w:unhideWhenUsed="1"/>
+    <w:lsdException w:name="Table Classic 4" w:semiHidden="1" w:unhideWhenUsed="1"/>
+    <w:lsdException w:name="Table Colorful 1" w:semiHidden="1" w:unhideWhenUsed="1"/>
+    <w:lsdException w:name="Table Colorful 2" w:semiHidden="1" w:unhideWhenUsed="1"/>
+    <w:lsdException w:name="Table Colorful 3" w:semiHidden="1" w:unhideWhenUsed="1"/>
+    <w:lsdException w:name="Table Columns 1" w:semiHidden="1" w:unhideWhenUsed="1"/>
+    <w:lsdException w:name="Table Columns 2" w:semiHidden="1" w:unhideWhenUsed="1"/>
+    <w:lsdException w:name="Table Columns 3" w:semiHidden="1" w:unhideWhenUsed="1"/>
+    <w:lsdException w:name="Table Columns 4" w:semiHidden="1" w:unhideWhenUsed="1"/>
+    <w:lsdException w:name="Table Columns 5" w:semiHidden="1" w:unhideWhenUsed="1"/>
+    <w:lsdException w:name="Table Grid 1" w:semiHidden="1" w:unhideWhenUsed="1"/>
+    <w:lsdException w:name="Table Grid 2" w:semiHidden="1" w:unhideWhenUsed="1"/>
+    <w:lsdException w:name="Table Grid 3" w:semiHidden="1" w:unhideWhenUsed="1"/>
+    <w:lsdException w:name="Table Grid 4" w:semiHidden="1" w:unhideWhenUsed="1"/>
+    <w:lsdException w:name="Table Grid 5" w:semiHidden="1" w:unhideWhenUsed="1"/>
+    <w:lsdException w:name="Table Grid 6" w:semiHidden="1" w:unhideWhenUsed="1"/>
+    <w:lsdException w:name="Table Grid 7" w:semiHidden="1" w:unhideWhenUsed="1"/>
+    <w:lsdException w:name="Table Grid 8" w:semiHidden="1" w:unhideWhenUsed="1"/>
+    <w:lsdException w:name="Table List 1" w:semiHidden="1" w:unhideWhenUsed="1"/>
+    <w:lsdException w:name="Table List 2" w:semiHidden="1" w:unhideWhenUsed="1"/>
+    <w:lsdException w:name="Table List 3" w:semiHidden="1" w:unhideWhenUsed="1"/>
+    <w:lsdException w:name="Table List 4" w:semiHidden="1" w:unhideWhenUsed="1"/>
+    <w:lsdException w:name="Table List 5" w:semiHidden="1" w:unhideWhenUsed="1"/>
+    <w:lsdException w:name="Table List 6" w:semiHidden="1" w:unhideWhenUsed="1"/>
+    <w:lsdException w:name="Table List 7" w:semiHidden="1" w:unhideWhenUsed="1"/>
+    <w:lsdException w:name="Table List 8" w:semiHidden="1" w:unhideWhenUsed="1"/>
+    <w:lsdException w:name="Table 3D effects 1" w:semiHidden="1" w:unhideWhenUsed="1"/>
+    <w:lsdException w:name="Table 3D effects 2" w:semiHidden="1" w:unhideWhenUsed="1"/>
+    <w:lsdException w:name="Table 3D effects 3" w:semiHidden="1" w:unhideWhenUsed="1"/>
+    <w:lsdException w:name="Table Contemporary" w:semiHidden="1" w:unhideWhenUsed="1"/>
+    <w:lsdException w:name="Table Elegant" w:semiHidden="1" w:unhideWhenUsed="1"/>
+    <w:lsdException w:name="Table Professional" w:semiHidden="1" w:unhideWhenUsed="1"/>
+    <w:lsdException w:name="Table Subtle 1" w:semiHidden="1" w:unhideWhenUsed="1"/>
+    <w:lsdException w:name="Table Subtle 2" w:semiHidden="1" w:unhideWhenUsed="1"/>
+    <w:lsdException w:name="Table Web 1" w:semiHidden="1" w:unhideWhenUsed="1"/>
+    <w:lsdException w:name="Table Web 2" w:semiHidden="1" w:unhideWhenUsed="1"/>
+    <w:lsdException w:name="Table Web 3" w:semiHidden="1" w:unhideWhenUsed="1"/>
+    <w:lsdException w:name="Balloon Text" w:semiHidden="1" w:unhideWhenUsed="1"/>
+    <w:lsdException w:name="Table Grid" w:uiPriority="39"/>
+    <w:lsdException w:name="Table Theme" w:semiHidden="1" w:unhideWhenUsed="1"/>
+    <w:lsdException w:name="Placeholder Text" w:semiHidden="1"/>
+    <w:lsdException w:name="No Spacing" w:uiPriority="1" w:qFormat="1"/>
+    <w:lsdException w:name="Light Shading" w:uiPriority="60"/>
+    <w:lsdException w:name="Light List" w:uiPriority="61"/>
+    <w:lsdException w:name="Light Grid" w:uiPriority="62"/>
+    <w:lsdException w:name="Medium Shading 1" w:uiPriority="63"/>
+    <w:lsdException w:name="Medium Shading 2" w:uiPriority="64"/>
+    <w:lsdException w:name="Medium List 1" w:uiPriority="65"/>
+    <w:lsdException w:name="Medium List 2" w:uiPriority="66"/>
+    <w:lsdException w:name="Medium Grid 1" w:uiPriority="67"/>
+    <w:lsdException w:name="Medium Grid 2" w:uiPriority="68"/>
+    <w:lsdException w:name="Medium Grid 3" w:uiPriority="69"/>
+    <w:lsdException w:name="Dark List" w:uiPriority="70"/>
+    <w:lsdException w:name="Colorful Shading" w:uiPriority="71"/>
+    <w:lsdException w:name="Colorful List" w:uiPriority="72"/>
+    <w:lsdException w:name="Colorful Grid" w:uiPriority="73"/>
+    <w:lsdException w:name="Light Shading Accent 1" w:uiPriority="60"/>
+    <w:lsdException w:name="Light List Accent 1" w:uiPriority="61"/>
+    <w:lsdException w:name="Light Grid Accent 1" w:uiPriority="62"/>
+    <w:lsdException w:name="Medium Shading 1 Accent 1" w:uiPriority="63"/>
+    <w:lsdException w:name="Medium Shading 2 Accent 1" w:uiPriority="64"/>
+    <w:lsdException w:name="Medium List 1 Accent 1" w:uiPriority="65"/>
+    <w:lsdException w:name="Revision" w:semiHidden="1"/>
+    <w:lsdException w:name="List Paragraph" w:uiPriority="34" w:qFormat="1"/>
+    <w:lsdException w:name="Quote" w:uiPriority="29" w:qFormat="1"/>
+    <w:lsdException w:name="Intense Quote" w:uiPriority="30" w:qFormat="1"/>
+    <w:lsdException w:name="Medium List 2 Accent 1" w:uiPriority="66"/>
+    <w:lsdException w:name="Medium Grid 1 Accent 1" w:uiPriority="67"/>
+    <w:lsdException w:name="Medium Grid 2 Accent 1" w:uiPriority="68"/>
+    <w:lsdException w:name="Medium Grid 3 Accent 1" w:uiPriority="69"/>
+    <w:lsdException w:name="Dark List Accent 1" w:uiPriority="70"/>
+    <w:lsdException w:name="Colorful Shading Accent 1" w:uiPriority="71"/>
+    <w:lsdException w:name="Colorful List Accent 1" w:uiPriority="72"/>
+    <w:lsdException w:name="Colorful Grid Accent 1" w:uiPriority="73"/>
+    <w:lsdException w:name="Light Shading Accent 2" w:uiPriority="60"/>
+    <w:lsdException w:name="Light List Accent 2" w:uiPriority="61"/>
+    <w:lsdException w:name="Light Grid Accent 2" w:uiPriority="62"/>
+    <w:lsdException w:name="Medium Shading 1 Accent 2" w:uiPriority="63"/>
+    <w:lsdException w:name="Medium Shading 2 Accent 2" w:uiPriority="64"/>
+    <w:lsdException w:name="Medium List 1 Accent 2" w:uiPriority="65"/>
+    <w:lsdException w:name="Medium List 2 Accent 2" w:uiPriority="66"/>
+    <w:lsdException w:name="Medium Grid 1 Accent 2" w:uiPriority="67"/>
+    <w:lsdException w:name="Medium Grid 2 Accent 2" w:uiPriority="68"/>
+    <w:lsdException w:name="Medium Grid 3 Accent 2" w:uiPriority="69"/>
+    <w:lsdException w:name="Dark List Accent 2" w:uiPriority="70"/>
+    <w:lsdException w:name="Colorful Shading Accent 2" w:uiPriority="71"/>
+    <w:lsdException w:name="Colorful List Accent 2" w:uiPriority="72"/>
+    <w:lsdException w:name="Colorful Grid Accent 2" w:uiPriority="73"/>
+    <w:lsdException w:name="Light Shading Accent 3" w:uiPriority="60"/>
+    <w:lsdException w:name="Light List Accent 3" w:uiPriority="61"/>
+    <w:lsdException w:name="Light Grid Accent 3" w:uiPriority="62"/>
+    <w:lsdException w:name="Medium Shading 1 Accent 3" w:uiPriority="63"/>
+    <w:lsdException w:name="Medium Shading 2 Accent 3" w:uiPriority="64"/>
+    <w:lsdException w:name="Medium List 1 Accent 3" w:uiPriority="65"/>
+    <w:lsdException w:name="Medium List 2 Accent 3" w:uiPriority="66"/>
+    <w:lsdException w:name="Medium Grid 1 Accent 3" w:uiPriority="67"/>
+    <w:lsdException w:name="Medium Grid 2 Accent 3" w:uiPriority="68"/>
+    <w:lsdException w:name="Medium Grid 3 Accent 3" w:uiPriority="69"/>
+    <w:lsdException w:name="Dark List Accent 3" w:uiPriority="70"/>
+    <w:lsdException w:name="Colorful Shading Accent 3" w:uiPriority="71"/>
+    <w:lsdException w:name="Colorful List Accent 3" w:uiPriority="72"/>
+    <w:lsdException w:name="Colorful Grid Accent 3" w:uiPriority="73"/>
+    <w:lsdException w:name="Light Shading Accent 4" w:uiPriority="60"/>
+    <w:lsdException w:name="Light List Accent 4" w:uiPriority="61"/>
+    <w:lsdException w:name="Light Grid Accent 4" w:uiPriority="62"/>
+    <w:lsdException w:name="Medium Shading 1 Accent 4" w:uiPriority="63"/>
+    <w:lsdException w:name="Medium Shading 2 Accent 4" w:uiPriority="64"/>
+    <w:lsdException w:name="Medium List 1 Accent 4" w:uiPriority="65"/>
+    <w:lsdException w:name="Medium List 2 Accent 4" w:uiPriority="66"/>
+    <w:lsdException w:name="Medium Grid 1 Accent 4" w:uiPriority="67"/>
+    <w:lsdException w:name="Medium Grid 2 Accent 4" w:uiPriority="68"/>
+    <w:lsdException w:name="Medium Grid 3 Accent 4" w:uiPriority="69"/>
+    <w:lsdException w:name="Dark List Accent 4" w:uiPriority="70"/>
+    <w:lsdException w:name="Colorful Shading Accent 4" w:uiPriority="71"/>
+    <w:lsdException w:name="Colorful List Accent 4" w:uiPriority="72"/>
+    <w:lsdException w:name="Colorful Grid Accent 4" w:uiPriority="73"/>
+    <w:lsdException w:name="Light Shading Accent 5" w:uiPriority="60"/>
+    <w:lsdException w:name="Light List Accent 5" w:uiPriority="61"/>
+    <w:lsdException w:name="Light Grid Accent 5" w:uiPriority="62"/>
+    <w:lsdException w:name="Medium Shading 1 Accent 5" w:uiPriority="63"/>
+    <w:lsdException w:name="Medium Shading 2 Accent 5" w:uiPriority="64"/>
+    <w:lsdException w:name="Medium List 1 Accent 5" w:uiPriority="65"/>
+    <w:lsdException w:name="Medium List 2 Accent 5" w:uiPriority="66"/>
+    <w:lsdException w:name="Medium Grid 1 Accent 5" w:uiPriority="67"/>
+    <w:lsdException w:name="Medium Grid 2 Accent 5" w:uiPriority="68"/>
+    <w:lsdException w:name="Medium Grid 3 Accent 5" w:uiPriority="69"/>
+    <w:lsdException w:name="Dark List Accent 5" w:uiPriority="70"/>
+    <w:lsdException w:name="Colorful Shading Accent 5" w:uiPriority="71"/>
+    <w:lsdException w:name="Colorful List Accent 5" w:uiPriority="72"/>
+    <w:lsdException w:name="Colorful Grid Accent 5" w:uiPriority="73"/>
+    <w:lsdException w:name="Light Shading Accent 6" w:uiPriority="60"/>
+    <w:lsdException w:name="Light List Accent 6" w:uiPriority="61"/>
+    <w:lsdException w:name="Light Grid Accent 6" w:uiPriority="62"/>
+    <w:lsdException w:name="Medium Shading 1 Accent 6" w:uiPriority="63"/>
+    <w:lsdException w:name="Medium Shading 2 Accent 6" w:uiPriority="64"/>
+    <w:lsdException w:name="Medium List 1 Accent 6" w:uiPriority="65"/>
+    <w:lsdException w:name="Medium List 2 Accent 6" w:uiPriority="66"/>
+    <w:lsdException w:name="Medium Grid 1 Accent 6" w:uiPriority="67"/>
+    <w:lsdException w:name="Medium Grid 2 Accent 6" w:uiPriority="68"/>
+    <w:lsdException w:name="Medium Grid 3 Accent 6" w:uiPriority="69"/>
+    <w:lsdException w:name="Dark List Accent 6" w:uiPriority="70"/>
+    <w:lsdException w:name="Colorful Shading Accent 6" w:uiPriority="71"/>
+    <w:lsdException w:name="Colorful List Accent 6" w:uiPriority="72"/>
+    <w:lsdException w:name="Colorful Grid Accent 6" w:uiPriority="73"/>
+    <w:lsdException w:name="Subtle Emphasis" w:uiPriority="19" w:qFormat="1"/>
+    <w:lsdException w:name="Intense Emphasis" w:uiPriority="21" w:qFormat="1"/>
+    <w:lsdException w:name="Subtle Reference" w:uiPriority="31" w:qFormat="1"/>
+    <w:lsdException w:name="Intense Reference" w:uiPriority="32" w:qFormat="1"/>
+    <w:lsdException w:name="Book Title" w:uiPriority="33" w:qFormat="1"/>
+    <w:lsdException w:name="Bibliography" w:semiHidden="1" w:uiPriority="37" w:unhideWhenUsed="1"/>
+    <w:lsdException w:name="TOC Heading" w:semiHidden="1" w:uiPriority="39" w:unhideWhenUsed="1" w:qFormat="1"/>
+    <w:lsdException w:name="Plain Table 1" w:uiPriority="41"/>
+    <w:lsdException w:name="Plain Table 2" w:uiPriority="42"/>
+    <w:lsdException w:name="Plain Table 3" w:uiPriority="43"/>
+    <w:lsdException w:name="Plain Table 4" w:uiPriority="44"/>
+    <w:lsdException w:name="Plain Table 5" w:uiPriority="45"/>
+    <w:lsdException w:name="Grid Table Light" w:uiPriority="40"/>
+    <w:lsdException w:name="Grid Table 1 Light" w:uiPriority="46"/>
+    <w:lsdException w:name="Grid Table 2" w:uiPriority="47"/>
+    <w:lsdException w:name="Grid Table 3" w:uiPriority="48"/>
+    <w:lsdException w:name="Grid Table 4" w:uiPriority="49"/>
+    <w:lsdException w:name="Grid Table 5 Dark" w:uiPriority="50"/>
+    <w:lsdException w:name="Grid Table 6 Colorful" w:uiPriority="51"/>
+    <w:lsdException w:name="Grid Table 7 Colorful" w:uiPriority="52"/>
+    <w:lsdException w:name="Grid Table 1 Light Accent 1" w:uiPriority="46"/>
+    <w:lsdException w:name="Grid Table 2 Accent 1" w:uiPriority="47"/>
+    <w:lsdException w:name="Grid Table 3 Accent 1" w:uiPriority="48"/>
+    <w:lsdException w:name="Grid Table 4 Accent 1" w:uiPriority="49"/>
+    <w:lsdException w:name="Grid Table 5 Dark Accent 1" w:uiPriority="50"/>
+    <w:lsdException w:name="Grid Table 6 Colorful Accent 1" w:uiPriority="51"/>
+    <w:lsdException w:name="Grid Table 7 Colorful Accent 1" w:uiPriority="52"/>
+    <w:lsdException w:name="Grid Table 1 Light Accent 2" w:uiPriority="46"/>
+    <w:lsdException w:name="Grid Table 2 Accent 2" w:uiPriority="47"/>
+    <w:lsdException w:name="Grid Table 3 Accent 2" w:uiPriority="48"/>
+    <w:lsdException w:name="Grid Table 4 Accent 2" w:uiPriority="49"/>
+    <w:lsdException w:name="Grid Table 5 Dark Accent 2" w:uiPriority="50"/>
+    <w:lsdException w:name="Grid Table 6 Colorful Accent 2" w:uiPriority="51"/>
+    <w:lsdException w:name="Grid Table 7 Colorful Accent 2" w:uiPriority="52"/>
+    <w:lsdException w:name="Grid Table 1 Light Accent 3" w:uiPriority="46"/>
+    <w:lsdException w:name="Grid Table 2 Accent 3" w:uiPriority="47"/>
+    <w:lsdException w:name="Grid Table 3 Accent 3" w:uiPriority="48"/>
+    <w:lsdException w:name="Grid Table 4 Accent 3" w:uiPriority="49"/>
+    <w:lsdException w:name="Grid Table 5 Dark Accent 3" w:uiPriority="50"/>
+    <w:lsdException w:name="Grid Table 6 Colorful Accent 3" w:uiPriority="51"/>
+    <w:lsdException w:name="Grid Table 7 Colorful Accent 3" w:uiPriority="52"/>
+    <w:lsdException w:name="Grid Table 1 Light Accent 4" w:uiPriority="46"/>
+    <w:lsdException w:name="Grid Table 2 Accent 4" w:uiPriority="47"/>
+    <w:lsdException w:name="Grid Table 3 Accent 4" w:uiPriority="48"/>
+    <w:lsdException w:name="Grid Table 4 Accent 4" w:uiPriority="49"/>
+    <w:lsdException w:name="Grid Table 5 Dark Accent 4" w:uiPriority="50"/>
+    <w:lsdException w:name="Grid Table 6 Colorful Accent 4" w:uiPriority="51"/>
+    <w:lsdException w:name="Grid Table 7 Colorful Accent 4" w:uiPriority="52"/>
+    <w:lsdException w:name="Grid Table 1 Light Accent 5" w:uiPriority="46"/>
+    <w:lsdException w:name="Grid Table 2 Accent 5" w:uiPriority="47"/>
+    <w:lsdException w:name="Grid Table 3 Accent 5" w:uiPriority="48"/>
+    <w:lsdException w:name="Grid Table 4 Accent 5" w:uiPriority="49"/>
+    <w:lsdException w:name="Grid Table 5 Dark Accent 5" w:uiPriority="50"/>
+    <w:lsdException w:name="Grid Table 6 Colorful Accent 5" w:uiPriority="51"/>
+    <w:lsdException w:name="Grid Table 7 Colorful Accent 5" w:uiPriority="52"/>
+    <w:lsdException w:name="Grid Table 1 Light Accent 6" w:uiPriority="46"/>
+    <w:lsdException w:name="Grid Table 2 Accent 6" w:uiPriority="47"/>
+    <w:lsdException w:name="Grid Table 3 Accent 6" w:uiPriority="48"/>
+    <w:lsdException w:name="Grid Table 4 Accent 6" w:uiPriority="49"/>
+    <w:lsdException w:name="Grid Table 5 Dark Accent 6" w:uiPriority="50"/>
+    <w:lsdException w:name="Grid Table 6 Colorful Accent 6" w:uiPriority="51"/>
+    <w:lsdException w:name="Grid Table 7 Colorful Accent 6" w:uiPriority="52"/>
+    <w:lsdException w:name="List Table 1 Light" w:uiPriority="46"/>
+    <w:lsdException w:name="List Table 2" w:uiPriority="47"/>
+    <w:lsdException w:name="List Table 3" w:uiPriority="48"/>
+    <w:lsdException w:name="List Table 4" w:uiPriority="49"/>
+    <w:lsdException w:name="List Table 5 Dark" w:uiPriority="50"/>
+    <w:lsdException w:name="List Table 6 Colorful" w:uiPriority="51"/>
+    <w:lsdException w:name="List Table 7 Colorful" w:uiPriority="52"/>
+    <w:lsdException w:name="List Table 1 Light Accent 1" w:uiPriority="46"/>
+    <w:lsdException w:name="List Table 2 Accent 1" w:uiPriority="47"/>
+    <w:lsdException w:name="List Table 3 Accent 1" w:uiPriority="48"/>
+    <w:lsdException w:name="List Table 4 Accent 1" w:uiPriority="49"/>
+    <w:lsdException w:name="List Table 5 Dark Accent 1" w:uiPriority="50"/>
+    <w:lsdException w:name="List Table 6 Colorful Accent 1" w:uiPriority="51"/>
+    <w:lsdException w:name="List Table 7 Colorful Accent 1" w:uiPriority="52"/>
+    <w:lsdException w:name="List Table 1 Light Accent 2" w:uiPriority="46"/>
+    <w:lsdException w:name="List Table 2 Accent 2" w:uiPriority="47"/>
+    <w:lsdException w:name="List Table 3 Accent 2" w:uiPriority="48"/>
+    <w:lsdException w:name="List Table 4 Accent 2" w:uiPriority="49"/>
+    <w:lsdException w:name="List Table 5 Dark Accent 2" w:uiPriority="50"/>
+    <w:lsdException w:name="List Table 6 Colorful Accent 2" w:uiPriority="51"/>
+    <w:lsdException w:name="List Table 7 Colorful Accent 2" w:uiPriority="52"/>
+    <w:lsdException w:name="List Table 1 Light Accent 3" w:uiPriority="46"/>
+    <w:lsdException w:name="List Table 2 Accent 3" w:uiPriority="47"/>
+    <w:lsdException w:name="List Table 3 Accent 3" w:uiPriority="48"/>
+    <w:lsdException w:name="List Table 4 Accent 3" w:uiPriority="49"/>
+    <w:lsdException w:name="List Table 5 Dark Accent 3" w:uiPriority="50"/>
+    <w:lsdException w:name="List Table 6 Colorful Accent 3" w:uiPriority="51"/>
+    <w:lsdException w:name="List Table 7 Colorful Accent 3" w:uiPriority="52"/>
+    <w:lsdException w:name="List Table 1 Light Accent 4" w:uiPriority="46"/>
+    <w:lsdException w:name="List Table 2 Accent 4" w:uiPriority="47"/>
+    <w:lsdException w:name="List Table 3 Accent 4" w:uiPriority="48"/>
+    <w:lsdException w:name="List Table 4 Accent 4" w:uiPriority="49"/>
+    <w:lsdException w:name="List Table 5 Dark Accent 4" w:uiPriority="50"/>
+    <w:lsdException w:name="List Table 6 Colorful Accent 4" w:uiPriority="51"/>
+    <w:lsdException w:name="List Table 7 Colorful Accent 4" w:uiPriority="52"/>
+    <w:lsdException w:name="List Table 1 Light Accent 5" w:uiPriority="46"/>
+    <w:lsdException w:name="List Table 2 Accent 5" w:uiPriority="47"/>
+    <w:lsdException w:name="List Table 3 Accent 5" w:uiPriority="48"/>
+    <w:lsdException w:name="List Table 4 Accent 5" w:uiPriority="49"/>
+    <w:lsdException w:name="List Table 5 Dark Accent 5" w:uiPriority="50"/>
+    <w:lsdException w:name="List Table 6 Colorful Accent 5" w:uiPriority="51"/>
+    <w:lsdException w:name="List Table 7 Colorful Accent 5" w:uiPriority="52"/>
+    <w:lsdException w:name="List Table 1 Light Accent 6" w:uiPriority="46"/>
+    <w:lsdException w:name="List Table 2 Accent 6" w:uiPriority="47"/>
+    <w:lsdException w:name="List Table 3 Accent 6" w:uiPriority="48"/>
+    <w:lsdException w:name="List Table 4 Accent 6" w:uiPriority="49"/>
+    <w:lsdException w:name="List Table 5 Dark Accent 6" w:uiPriority="50"/>
+    <w:lsdException w:name="List Table 6 Colorful Accent 6" w:uiPriority="51"/>
+    <w:lsdException w:name="List Table 7 Colorful Accent 6" w:uiPriority="52"/>
+    <w:lsdException w:name="Mention" w:semiHidden="1" w:unhideWhenUsed="1"/>
+    <w:lsdException w:name="Smart Hyperlink" w:semiHidden="1" w:unhideWhenUsed="1"/>
+    <w:lsdException w:name="Hashtag" w:semiHidden="1" w:unhideWhenUsed="1"/>
+    <w:lsdException w:name="Unresolved Mention" w:semiHidden="1" w:unhideWhenUsed="1"/>
+    <w:lsdException w:name="Smart Link" w:semiHidden="1" w:unhideWhenUsed="1"/>
+  </w:latentStyles>
+  <w:style w:type="paragraph" w:default="1" w:styleId="Normal">
+    <w:name w:val="Normal"/>
+    <w:qFormat/>
+    <w:pPr>
+      <w:spacing w:line="262" w:lineRule="auto"/>
+      <w:ind w:hanging="10"/>
+    </w:pPr>
+    <w:rPr>
+      <w:color w:val="000000"/>
+      <w:lang w:bidi="en-US"/>
+    </w:rPr>
   </w:style>
   <w:style w:type="paragraph" w:styleId="Heading1">
     <w:name w:val="heading 1"/>
-    <w:basedOn w:val="Normal"/>
     <w:next w:val="Normal"/>
+    <w:link w:val="Heading1Char"/>
+    <w:uiPriority w:val="9"/>
+    <w:qFormat/>
     <w:pPr>
-      <w:keepNext w:val="1"/>
-      <w:keepLines w:val="1"/>
-      <w:pageBreakBefore w:val="0"/>
-      <w:widowControl w:val="1"/>
-      <w:pBdr>
-        <w:top w:space="0" w:sz="0" w:val="nil"/>
-        <w:left w:space="0" w:sz="0" w:val="nil"/>
-        <w:bottom w:space="0" w:sz="0" w:val="nil"/>
-        <w:right w:space="0" w:sz="0" w:val="nil"/>
-        <w:between w:space="0" w:sz="0" w:val="nil"/>
-      </w:pBdr>
-      <w:shd w:fill="auto" w:val="clear"/>
-      <w:spacing w:after="84" w:before="0" w:line="259" w:lineRule="auto"/>
-      <w:ind w:left="10" w:right="0" w:hanging="10"/>
-      <w:jc w:val="left"/>
+      <w:keepNext/>
+      <w:keepLines/>
+      <w:spacing w:after="84" w:line="259" w:lineRule="auto"/>
+      <w:ind w:hanging="10"/>
+      <w:outlineLvl w:val="0"/>
     </w:pPr>
     <w:rPr>
-      <w:rFonts w:ascii="Arial" w:cs="Arial" w:eastAsia="Arial" w:hAnsi="Arial"/>
-      <w:b w:val="1"/>
-      <w:bCs w:val="1"/>
-      <w:i w:val="0"/>
-      <w:iCs w:val="0"/>
-      <w:smallCaps w:val="0"/>
-      <w:strike w:val="0"/>
+      <w:b/>
       <w:color w:val="000000"/>
-      <w:sz w:val="24"/>
-      <w:szCs w:val="24"/>
-      <w:u w:val="none"/>
-      <w:shd w:fill="auto" w:val="clear"/>
-      <w:vertAlign w:val="baseline"/>
     </w:rPr>
   </w:style>
   <w:style w:type="paragraph" w:styleId="Heading2">
     <w:name w:val="heading 2"/>
     <w:basedOn w:val="Normal"/>
     <w:next w:val="Normal"/>
+    <w:uiPriority w:val="9"/>
+    <w:semiHidden/>
+    <w:unhideWhenUsed/>
+    <w:qFormat/>
     <w:pPr>
-      <w:keepNext w:val="1"/>
-      <w:keepLines w:val="1"/>
-      <w:pageBreakBefore w:val="0"/>
-      <w:spacing w:after="80" w:before="360" w:lineRule="auto"/>
+      <w:keepNext/>
+      <w:keepLines/>
+      <w:spacing w:before="360" w:after="80"/>
+      <w:outlineLvl w:val="1"/>
     </w:pPr>
     <w:rPr>
-      <w:b w:val="1"/>
-      <w:bCs w:val="1"/>
+      <w:b/>
+      <w:bCs/>
       <w:sz w:val="36"/>
       <w:szCs w:val="36"/>
     </w:rPr>
@@ -2031,15 +2170,19 @@
     <w:name w:val="heading 3"/>
     <w:basedOn w:val="Normal"/>
     <w:next w:val="Normal"/>
+    <w:uiPriority w:val="9"/>
+    <w:semiHidden/>
+    <w:unhideWhenUsed/>
+    <w:qFormat/>
     <w:pPr>
-      <w:keepNext w:val="1"/>
-      <w:keepLines w:val="1"/>
-      <w:pageBreakBefore w:val="0"/>
-      <w:spacing w:after="80" w:before="280" w:lineRule="auto"/>
+      <w:keepNext/>
+      <w:keepLines/>
+      <w:spacing w:before="280" w:after="80"/>
+      <w:outlineLvl w:val="2"/>
     </w:pPr>
     <w:rPr>
-      <w:b w:val="1"/>
-      <w:bCs w:val="1"/>
+      <w:b/>
+      <w:bCs/>
       <w:sz w:val="28"/>
       <w:szCs w:val="28"/>
     </w:rPr>
@@ -2048,15 +2191,19 @@
     <w:name w:val="heading 4"/>
     <w:basedOn w:val="Normal"/>
     <w:next w:val="Normal"/>
+    <w:uiPriority w:val="9"/>
+    <w:semiHidden/>
+    <w:unhideWhenUsed/>
+    <w:qFormat/>
     <w:pPr>
-      <w:keepNext w:val="1"/>
-      <w:keepLines w:val="1"/>
-      <w:pageBreakBefore w:val="0"/>
-      <w:spacing w:after="40" w:before="240" w:lineRule="auto"/>
+      <w:keepNext/>
+      <w:keepLines/>
+      <w:spacing w:before="240" w:after="40"/>
+      <w:outlineLvl w:val="3"/>
     </w:pPr>
     <w:rPr>
-      <w:b w:val="1"/>
-      <w:bCs w:val="1"/>
+      <w:b/>
+      <w:bCs/>
       <w:sz w:val="24"/>
       <w:szCs w:val="24"/>
     </w:rPr>
@@ -2065,15 +2212,19 @@
     <w:name w:val="heading 5"/>
     <w:basedOn w:val="Normal"/>
     <w:next w:val="Normal"/>
+    <w:uiPriority w:val="9"/>
+    <w:semiHidden/>
+    <w:unhideWhenUsed/>
+    <w:qFormat/>
     <w:pPr>
-      <w:keepNext w:val="1"/>
-      <w:keepLines w:val="1"/>
-      <w:pageBreakBefore w:val="0"/>
-      <w:spacing w:after="40" w:before="220" w:lineRule="auto"/>
+      <w:keepNext/>
+      <w:keepLines/>
+      <w:spacing w:before="220" w:after="40"/>
+      <w:outlineLvl w:val="4"/>
     </w:pPr>
     <w:rPr>
-      <w:b w:val="1"/>
-      <w:bCs w:val="1"/>
+      <w:b/>
+      <w:bCs/>
       <w:sz w:val="22"/>
       <w:szCs w:val="22"/>
     </w:rPr>
@@ -2082,102 +2233,85 @@
     <w:name w:val="heading 6"/>
     <w:basedOn w:val="Normal"/>
     <w:next w:val="Normal"/>
+    <w:uiPriority w:val="9"/>
+    <w:semiHidden/>
+    <w:unhideWhenUsed/>
+    <w:qFormat/>
     <w:pPr>
-      <w:keepNext w:val="1"/>
-      <w:keepLines w:val="1"/>
-      <w:pageBreakBefore w:val="0"/>
-      <w:spacing w:after="40" w:before="200" w:lineRule="auto"/>
+      <w:keepNext/>
+      <w:keepLines/>
+      <w:spacing w:before="200" w:after="40"/>
+      <w:outlineLvl w:val="5"/>
     </w:pPr>
     <w:rPr>
-      <w:b w:val="1"/>
-      <w:bCs w:val="1"/>
+      <w:b/>
+      <w:bCs/>
       <w:sz w:val="20"/>
       <w:szCs w:val="20"/>
     </w:rPr>
+  </w:style>
+  <w:style w:type="character" w:default="1" w:styleId="DefaultParagraphFont">
+    <w:name w:val="Default Paragraph Font"/>
+    <w:uiPriority w:val="1"/>
+    <w:semiHidden/>
+    <w:unhideWhenUsed/>
+  </w:style>
+  <w:style w:type="table" w:default="1" w:styleId="TableNormal">
+    <w:name w:val="Normal Table"/>
+    <w:uiPriority w:val="99"/>
+    <w:semiHidden/>
+    <w:unhideWhenUsed/>
+    <w:tblPr>
+      <w:tblInd w:w="0" w:type="dxa"/>
+      <w:tblCellMar>
+        <w:top w:w="0" w:type="dxa"/>
+        <w:left w:w="108" w:type="dxa"/>
+        <w:bottom w:w="0" w:type="dxa"/>
+        <w:right w:w="108" w:type="dxa"/>
+      </w:tblCellMar>
+    </w:tblPr>
+  </w:style>
+  <w:style w:type="numbering" w:default="1" w:styleId="NoList">
+    <w:name w:val="No List"/>
+    <w:uiPriority w:val="99"/>
+    <w:semiHidden/>
+    <w:unhideWhenUsed/>
+  </w:style>
+  <w:style w:type="table" w:customStyle="1" w:styleId="TableNormal0">
+    <w:name w:val="TableNormal"/>
+    <w:tblPr>
+      <w:tblCellMar>
+        <w:top w:w="100" w:type="dxa"/>
+        <w:left w:w="100" w:type="dxa"/>
+        <w:bottom w:w="100" w:type="dxa"/>
+        <w:right w:w="100" w:type="dxa"/>
+      </w:tblCellMar>
+    </w:tblPr>
   </w:style>
   <w:style w:type="paragraph" w:styleId="Title">
     <w:name w:val="Title"/>
     <w:basedOn w:val="Normal"/>
     <w:next w:val="Normal"/>
+    <w:uiPriority w:val="10"/>
+    <w:qFormat/>
     <w:pPr>
-      <w:keepNext w:val="1"/>
-      <w:keepLines w:val="1"/>
-      <w:pageBreakBefore w:val="0"/>
-      <w:spacing w:after="120" w:before="480" w:lineRule="auto"/>
+      <w:keepNext/>
+      <w:keepLines/>
+      <w:spacing w:before="480" w:after="120"/>
     </w:pPr>
     <w:rPr>
-      <w:b w:val="1"/>
-      <w:bCs w:val="1"/>
+      <w:b/>
+      <w:bCs/>
       <w:sz w:val="72"/>
       <w:szCs w:val="72"/>
     </w:rPr>
   </w:style>
-  <w:style w:type="paragraph" w:styleId="Normal" w:default="1">
-    <w:name w:val="Normal"/>
-    <w:qFormat w:val="1"/>
-    <w:pPr>
-      <w:spacing w:after="4" w:line="262" w:lineRule="auto"/>
-      <w:ind w:left="10" w:right="182" w:hanging="10"/>
-    </w:pPr>
-    <w:rPr>
-      <w:rFonts w:ascii="Arial" w:cs="Arial" w:eastAsia="Arial" w:hAnsi="Arial"/>
-      <w:color w:val="000000"/>
-      <w:sz w:val="21"/>
-      <w:lang w:bidi="en-US"/>
-    </w:rPr>
-  </w:style>
-  <w:style w:type="paragraph" w:styleId="Heading1">
-    <w:name w:val="heading 1"/>
-    <w:next w:val="Normal"/>
-    <w:link w:val="Heading1Char"/>
-    <w:uiPriority w:val="9"/>
-    <w:qFormat w:val="1"/>
-    <w:pPr>
-      <w:keepNext w:val="1"/>
-      <w:keepLines w:val="1"/>
-      <w:spacing w:after="84" w:line="259" w:lineRule="auto"/>
-      <w:ind w:left="10" w:hanging="10"/>
-      <w:outlineLvl w:val="0"/>
-    </w:pPr>
-    <w:rPr>
-      <w:rFonts w:ascii="Arial" w:cs="Arial" w:eastAsia="Arial" w:hAnsi="Arial"/>
-      <w:b w:val="1"/>
-      <w:color w:val="000000"/>
-    </w:rPr>
-  </w:style>
-  <w:style w:type="character" w:styleId="DefaultParagraphFont" w:default="1">
-    <w:name w:val="Default Paragraph Font"/>
-    <w:uiPriority w:val="1"/>
-    <w:semiHidden w:val="1"/>
-    <w:unhideWhenUsed w:val="1"/>
-  </w:style>
-  <w:style w:type="table" w:styleId="TableNormal" w:default="1">
-    <w:name w:val="Normal Table"/>
-    <w:uiPriority w:val="99"/>
-    <w:semiHidden w:val="1"/>
-    <w:unhideWhenUsed w:val="1"/>
-    <w:tblPr>
-      <w:tblInd w:w="0.0" w:type="dxa"/>
-      <w:tblCellMar>
-        <w:top w:w="0.0" w:type="dxa"/>
-        <w:left w:w="108.0" w:type="dxa"/>
-        <w:bottom w:w="0.0" w:type="dxa"/>
-        <w:right w:w="108.0" w:type="dxa"/>
-      </w:tblCellMar>
-    </w:tblPr>
-  </w:style>
-  <w:style w:type="numbering" w:styleId="NoList" w:default="1">
-    <w:name w:val="No List"/>
-    <w:uiPriority w:val="99"/>
-    <w:semiHidden w:val="1"/>
-    <w:unhideWhenUsed w:val="1"/>
-  </w:style>
-  <w:style w:type="character" w:styleId="Heading1Char" w:customStyle="1">
+  <w:style w:type="character" w:customStyle="1" w:styleId="Heading1Char">
     <w:name w:val="Heading 1 Char"/>
     <w:link w:val="Heading1"/>
     <w:rPr>
-      <w:rFonts w:ascii="Arial" w:cs="Arial" w:eastAsia="Arial" w:hAnsi="Arial"/>
-      <w:b w:val="1"/>
+      <w:rFonts w:ascii="Arial" w:eastAsia="Arial" w:hAnsi="Arial" w:cs="Arial"/>
+      <w:b/>
       <w:color w:val="000000"/>
       <w:sz w:val="24"/>
     </w:rPr>
@@ -2186,16 +2320,17 @@
     <w:name w:val="Subtitle"/>
     <w:basedOn w:val="Normal"/>
     <w:next w:val="Normal"/>
+    <w:uiPriority w:val="11"/>
+    <w:qFormat/>
     <w:pPr>
-      <w:keepNext w:val="1"/>
-      <w:keepLines w:val="1"/>
-      <w:pageBreakBefore w:val="0"/>
-      <w:spacing w:after="80" w:before="360" w:lineRule="auto"/>
+      <w:keepNext/>
+      <w:keepLines/>
+      <w:spacing w:before="360" w:after="80"/>
     </w:pPr>
     <w:rPr>
-      <w:rFonts w:ascii="Georgia" w:cs="Georgia" w:eastAsia="Georgia" w:hAnsi="Georgia"/>
-      <w:i w:val="1"/>
-      <w:iCs w:val="1"/>
+      <w:rFonts w:ascii="Georgia" w:eastAsia="Georgia" w:hAnsi="Georgia" w:cs="Georgia"/>
+      <w:i/>
+      <w:iCs/>
       <w:color w:val="666666"/>
       <w:sz w:val="48"/>
       <w:szCs w:val="48"/>
@@ -2499,17 +2634,17 @@
 </a:theme>
 </file>
 
-<file path=customXML/item1.xml><?xml version="1.0" encoding="utf-8"?>
+<file path=customXml/item1.xml><?xml version="1.0" encoding="utf-8"?>
 <go:gDocsCustomXmlDataStorage xmlns:go="http://customooxmlschemas.google.com/" xmlns:r="http://schemas.openxmlformats.org/officeDocument/2006/relationships" uri="GoogleDocsCustomDataVersion2">
   <go:docsCustomData xmlns:go="http://customooxmlschemas.google.com/" roundtripDataSignature="AMtx7mjOjS63zuGT5RPqabvBFNL6BrV4Bg==">CgMxLjA4AHIhMXBPTV9KcVNENkw4OTA0TDZ4Rk5heWQ4ekF6ZmRoRjlq</go:docsCustomData>
 </go:gDocsCustomXmlDataStorage>
 </file>
 
-<file path=customXML/itemProps1.xml><?xml version="1.0" encoding="utf-8"?>
+<file path=customXml/itemProps1.xml><?xml version="1.0" encoding="utf-8"?>
 <ds:datastoreItem xmlns:ds="http://schemas.openxmlformats.org/officeDocument/2006/customXml" ds:itemID="{11111111-1234-1234-1234-123412341234}">
   <ds:schemaRefs>
+    <ds:schemaRef ds:uri="http://customooxmlschemas.google.com/"/>
     <ds:schemaRef ds:uri="http://schemas.openxmlformats.org/officeDocument/2006/relationships"/>
-    <ds:schemaRef ds:uri="http://customooxmlschemas.google.com/"/>
   </ds:schemaRefs>
 </ds:datastoreItem>
 </file>
</xml_diff>